<commit_message>
arreglo ipy parte 1 y word
</commit_message>
<xml_diff>
--- a/Archivos/Informe_TP1_CienciaDeDatos.docx
+++ b/Archivos/Informe_TP1_CienciaDeDatos.docx
@@ -175,22 +175,29 @@
         </w:rPr>
         <w:t xml:space="preserve">Meyer </w:t>
       </w:r>
-      <w:proofErr w:type="gramStart"/>
       <w:r>
         <w:rPr>
           <w:b/>
           <w:bCs/>
           <w:lang w:val="es-AR"/>
         </w:rPr>
-        <w:t>Nahuel  —</w:t>
-      </w:r>
-      <w:proofErr w:type="gramEnd"/>
+        <w:t xml:space="preserve">Nahuel </w:t>
+      </w:r>
+      <w:proofErr w:type="gramStart"/>
       <w:r>
         <w:rPr>
           <w:b/>
           <w:bCs/>
           <w:lang w:val="es-AR"/>
         </w:rPr>
+        <w:t>-</w:t>
+      </w:r>
+      <w:r>
+        <w:rPr>
+          <w:b/>
+          <w:bCs/>
+          <w:lang w:val="es-AR"/>
+        </w:rPr>
         <w:t xml:space="preserve">  </w:t>
       </w:r>
       <w:r>
@@ -199,6 +206,7 @@
         </w:rPr>
         <w:t>nahuelmeyer16@gmail.com</w:t>
       </w:r>
+      <w:proofErr w:type="gramEnd"/>
     </w:p>
     <w:p>
       <w:pPr>
@@ -216,22 +224,29 @@
         </w:rPr>
         <w:t xml:space="preserve">Herbel </w:t>
       </w:r>
-      <w:proofErr w:type="gramStart"/>
       <w:r>
         <w:rPr>
           <w:b/>
           <w:bCs/>
           <w:lang w:val="es-AR"/>
         </w:rPr>
-        <w:t>Aldana  —</w:t>
-      </w:r>
-      <w:proofErr w:type="gramEnd"/>
+        <w:t xml:space="preserve">Aldana </w:t>
+      </w:r>
+      <w:proofErr w:type="gramStart"/>
       <w:r>
         <w:rPr>
           <w:b/>
           <w:bCs/>
           <w:lang w:val="es-AR"/>
         </w:rPr>
+        <w:t>-</w:t>
+      </w:r>
+      <w:r>
+        <w:rPr>
+          <w:b/>
+          <w:bCs/>
+          <w:lang w:val="es-AR"/>
+        </w:rPr>
         <w:t xml:space="preserve">  </w:t>
       </w:r>
       <w:r>
@@ -240,6 +255,7 @@
         </w:rPr>
         <w:t>aldanaherbell@gmail.com</w:t>
       </w:r>
+      <w:proofErr w:type="gramEnd"/>
     </w:p>
     <w:p>
       <w:pPr>
@@ -267,22 +283,29 @@
         </w:rPr>
         <w:t xml:space="preserve"> </w:t>
       </w:r>
-      <w:proofErr w:type="gramStart"/>
       <w:r>
         <w:rPr>
           <w:b/>
           <w:bCs/>
           <w:lang w:val="es-AR"/>
         </w:rPr>
-        <w:t>Iván  —</w:t>
-      </w:r>
-      <w:proofErr w:type="gramEnd"/>
+        <w:t xml:space="preserve">Iván </w:t>
+      </w:r>
+      <w:proofErr w:type="gramStart"/>
       <w:r>
         <w:rPr>
           <w:b/>
           <w:bCs/>
           <w:lang w:val="es-AR"/>
         </w:rPr>
+        <w:t>-</w:t>
+      </w:r>
+      <w:r>
+        <w:rPr>
+          <w:b/>
+          <w:bCs/>
+          <w:lang w:val="es-AR"/>
+        </w:rPr>
         <w:t xml:space="preserve">  </w:t>
       </w:r>
       <w:r>
@@ -291,6 +314,7 @@
         </w:rPr>
         <w:t>ivanmatiasoggier@hotmail.com</w:t>
       </w:r>
+      <w:proofErr w:type="gramEnd"/>
     </w:p>
     <w:p>
       <w:pPr>
@@ -308,22 +332,29 @@
         </w:rPr>
         <w:t xml:space="preserve">Soler </w:t>
       </w:r>
-      <w:proofErr w:type="gramStart"/>
       <w:r>
         <w:rPr>
           <w:b/>
           <w:bCs/>
           <w:lang w:val="es-AR"/>
         </w:rPr>
-        <w:t>Lautaro  —</w:t>
-      </w:r>
-      <w:proofErr w:type="gramEnd"/>
+        <w:t xml:space="preserve">Lautaro </w:t>
+      </w:r>
+      <w:proofErr w:type="gramStart"/>
       <w:r>
         <w:rPr>
           <w:b/>
           <w:bCs/>
           <w:lang w:val="es-AR"/>
         </w:rPr>
+        <w:t>-</w:t>
+      </w:r>
+      <w:r>
+        <w:rPr>
+          <w:b/>
+          <w:bCs/>
+          <w:lang w:val="es-AR"/>
+        </w:rPr>
         <w:t xml:space="preserve">  </w:t>
       </w:r>
       <w:r>
@@ -332,6 +363,7 @@
         </w:rPr>
         <w:t>solerlautaro@gmail.com</w:t>
       </w:r>
+      <w:proofErr w:type="gramEnd"/>
     </w:p>
     <w:p>
       <w:pPr>
@@ -467,6 +499,12 @@
         </w:rPr>
         <w:t xml:space="preserve"> contiene registros de sensores de equipos industriales y la variable objetivo indica si el equipo sufrió una falla (</w:t>
       </w:r>
+      <w:r>
+        <w:rPr>
+          <w:lang w:val="es-AR"/>
+        </w:rPr>
+        <w:t>“</w:t>
+      </w:r>
       <w:proofErr w:type="spellStart"/>
       <w:r>
         <w:rPr>
@@ -479,7 +517,37 @@
         <w:rPr>
           <w:lang w:val="es-AR"/>
         </w:rPr>
-        <w:t>) o no (normal). El objetivo es construir modelos capaces de predecir fallas con la mayor sensibilidad posible, ya que en el contexto industrial un fallo no detectado puede resultar en pérdidas económicas significativas o accidentes</w:t>
+        <w:t>”</w:t>
+      </w:r>
+      <w:r>
+        <w:rPr>
+          <w:lang w:val="es-AR"/>
+        </w:rPr>
+        <w:t>) o no (</w:t>
+      </w:r>
+      <w:r>
+        <w:rPr>
+          <w:lang w:val="es-AR"/>
+        </w:rPr>
+        <w:t>“</w:t>
+      </w:r>
+      <w:r>
+        <w:rPr>
+          <w:lang w:val="es-AR"/>
+        </w:rPr>
+        <w:t>normal</w:t>
+      </w:r>
+      <w:r>
+        <w:rPr>
+          <w:lang w:val="es-AR"/>
+        </w:rPr>
+        <w:t>”</w:t>
+      </w:r>
+      <w:r>
+        <w:rPr>
+          <w:lang w:val="es-AR"/>
+        </w:rPr>
+        <w:t>). El objetivo es construir modelos capaces de predecir fallas con la mayor sensibilidad posible, ya que en el contexto industrial un fallo no detectado puede resultar en pérdidas económicas significativas o accidentes</w:t>
       </w:r>
       <w:r>
         <w:rPr>
@@ -584,12 +652,6 @@
         <w:gridCol w:w="6560"/>
       </w:tblGrid>
       <w:tr>
-        <w:tblPrEx>
-          <w:tblCellMar>
-            <w:top w:w="0" w:type="dxa"/>
-            <w:bottom w:w="0" w:type="dxa"/>
-          </w:tblCellMar>
-        </w:tblPrEx>
         <w:trPr>
           <w:tblHeader/>
         </w:trPr>
@@ -663,12 +725,6 @@
         </w:tc>
       </w:tr>
       <w:tr>
-        <w:tblPrEx>
-          <w:tblCellMar>
-            <w:top w:w="0" w:type="dxa"/>
-            <w:bottom w:w="0" w:type="dxa"/>
-          </w:tblCellMar>
-        </w:tblPrEx>
         <w:tc>
           <w:tcPr>
             <w:tcW w:w="2800" w:type="dxa"/>
@@ -734,12 +790,6 @@
         </w:tc>
       </w:tr>
       <w:tr>
-        <w:tblPrEx>
-          <w:tblCellMar>
-            <w:top w:w="0" w:type="dxa"/>
-            <w:bottom w:w="0" w:type="dxa"/>
-          </w:tblCellMar>
-        </w:tblPrEx>
         <w:tc>
           <w:tcPr>
             <w:tcW w:w="2800" w:type="dxa"/>
@@ -805,12 +855,6 @@
         </w:tc>
       </w:tr>
       <w:tr>
-        <w:tblPrEx>
-          <w:tblCellMar>
-            <w:top w:w="0" w:type="dxa"/>
-            <w:bottom w:w="0" w:type="dxa"/>
-          </w:tblCellMar>
-        </w:tblPrEx>
         <w:tc>
           <w:tcPr>
             <w:tcW w:w="2800" w:type="dxa"/>
@@ -861,36 +905,51 @@
             <w:vAlign w:val="center"/>
           </w:tcPr>
           <w:p>
-            <w:r>
+            <w:pPr>
               <w:rPr>
                 <w:lang w:val="es-AR"/>
               </w:rPr>
+            </w:pPr>
+            <w:r>
+              <w:rPr>
+                <w:lang w:val="es-AR"/>
+              </w:rPr>
               <w:t xml:space="preserve">Tipo de producto fabricado. </w:t>
             </w:r>
-            <w:proofErr w:type="spellStart"/>
-            <w:r>
+            <w:r>
+              <w:rPr>
+                <w:lang w:val="es-AR"/>
+              </w:rPr>
               <w:t>Categ</w:t>
             </w:r>
             <w:r>
+              <w:rPr>
+                <w:lang w:val="es-AR"/>
+              </w:rPr>
               <w:t>orías</w:t>
             </w:r>
-            <w:proofErr w:type="spellEnd"/>
-            <w:r>
+            <w:r>
+              <w:rPr>
+                <w:lang w:val="es-AR"/>
+              </w:rPr>
               <w:t xml:space="preserve">: </w:t>
             </w:r>
             <w:r>
+              <w:rPr>
+                <w:lang w:val="es-AR"/>
+              </w:rPr>
               <w:t>“L”, “M”, “H”</w:t>
+            </w:r>
+            <w:r>
+              <w:rPr>
+                <w:lang w:val="es-AR"/>
+              </w:rPr>
+              <w:t>.</w:t>
             </w:r>
           </w:p>
         </w:tc>
       </w:tr>
       <w:tr>
-        <w:tblPrEx>
-          <w:tblCellMar>
-            <w:top w:w="0" w:type="dxa"/>
-            <w:bottom w:w="0" w:type="dxa"/>
-          </w:tblCellMar>
-        </w:tblPrEx>
         <w:tc>
           <w:tcPr>
             <w:tcW w:w="2800" w:type="dxa"/>
@@ -961,12 +1020,6 @@
         </w:tc>
       </w:tr>
       <w:tr>
-        <w:tblPrEx>
-          <w:tblCellMar>
-            <w:top w:w="0" w:type="dxa"/>
-            <w:bottom w:w="0" w:type="dxa"/>
-          </w:tblCellMar>
-        </w:tblPrEx>
         <w:tc>
           <w:tcPr>
             <w:tcW w:w="2800" w:type="dxa"/>
@@ -1037,12 +1090,6 @@
         </w:tc>
       </w:tr>
       <w:tr>
-        <w:tblPrEx>
-          <w:tblCellMar>
-            <w:top w:w="0" w:type="dxa"/>
-            <w:bottom w:w="0" w:type="dxa"/>
-          </w:tblCellMar>
-        </w:tblPrEx>
         <w:tc>
           <w:tcPr>
             <w:tcW w:w="2800" w:type="dxa"/>
@@ -1104,12 +1151,6 @@
         </w:tc>
       </w:tr>
       <w:tr>
-        <w:tblPrEx>
-          <w:tblCellMar>
-            <w:top w:w="0" w:type="dxa"/>
-            <w:bottom w:w="0" w:type="dxa"/>
-          </w:tblCellMar>
-        </w:tblPrEx>
         <w:tc>
           <w:tcPr>
             <w:tcW w:w="2800" w:type="dxa"/>
@@ -1171,12 +1212,6 @@
         </w:tc>
       </w:tr>
       <w:tr>
-        <w:tblPrEx>
-          <w:tblCellMar>
-            <w:top w:w="0" w:type="dxa"/>
-            <w:bottom w:w="0" w:type="dxa"/>
-          </w:tblCellMar>
-        </w:tblPrEx>
         <w:tc>
           <w:tcPr>
             <w:tcW w:w="2800" w:type="dxa"/>
@@ -1247,12 +1282,6 @@
         </w:tc>
       </w:tr>
       <w:tr>
-        <w:tblPrEx>
-          <w:tblCellMar>
-            <w:top w:w="0" w:type="dxa"/>
-            <w:bottom w:w="0" w:type="dxa"/>
-          </w:tblCellMar>
-        </w:tblPrEx>
         <w:tc>
           <w:tcPr>
             <w:tcW w:w="2800" w:type="dxa"/>
@@ -1519,12 +1548,6 @@
         <w:gridCol w:w="3124"/>
       </w:tblGrid>
       <w:tr>
-        <w:tblPrEx>
-          <w:tblCellMar>
-            <w:top w:w="0" w:type="dxa"/>
-            <w:bottom w:w="0" w:type="dxa"/>
-          </w:tblCellMar>
-        </w:tblPrEx>
         <w:trPr>
           <w:tblHeader/>
         </w:trPr>
@@ -1698,12 +1721,6 @@
         </w:tc>
       </w:tr>
       <w:tr>
-        <w:tblPrEx>
-          <w:tblCellMar>
-            <w:top w:w="0" w:type="dxa"/>
-            <w:bottom w:w="0" w:type="dxa"/>
-          </w:tblCellMar>
-        </w:tblPrEx>
         <w:tc>
           <w:tcPr>
             <w:tcW w:w="1984" w:type="dxa"/>
@@ -1835,7 +1852,7 @@
                 <w:sz w:val="20"/>
                 <w:szCs w:val="20"/>
               </w:rPr>
-              <w:t>60</w:t>
+              <w:t>6</w:t>
             </w:r>
           </w:p>
         </w:tc>
@@ -1958,12 +1975,6 @@
         </w:tc>
       </w:tr>
       <w:tr>
-        <w:tblPrEx>
-          <w:tblCellMar>
-            <w:top w:w="0" w:type="dxa"/>
-            <w:bottom w:w="0" w:type="dxa"/>
-          </w:tblCellMar>
-        </w:tblPrEx>
         <w:tc>
           <w:tcPr>
             <w:tcW w:w="1984" w:type="dxa"/>
@@ -2179,12 +2190,6 @@
         </w:tc>
       </w:tr>
       <w:tr>
-        <w:tblPrEx>
-          <w:tblCellMar>
-            <w:top w:w="0" w:type="dxa"/>
-            <w:bottom w:w="0" w:type="dxa"/>
-          </w:tblCellMar>
-        </w:tblPrEx>
         <w:tc>
           <w:tcPr>
             <w:tcW w:w="1984" w:type="dxa"/>
@@ -2418,12 +2423,6 @@
         </w:tc>
       </w:tr>
       <w:tr>
-        <w:tblPrEx>
-          <w:tblCellMar>
-            <w:top w:w="0" w:type="dxa"/>
-            <w:bottom w:w="0" w:type="dxa"/>
-          </w:tblCellMar>
-        </w:tblPrEx>
         <w:tc>
           <w:tcPr>
             <w:tcW w:w="1984" w:type="dxa"/>
@@ -2667,12 +2666,6 @@
         </w:tc>
       </w:tr>
       <w:tr>
-        <w:tblPrEx>
-          <w:tblCellMar>
-            <w:top w:w="0" w:type="dxa"/>
-            <w:bottom w:w="0" w:type="dxa"/>
-          </w:tblCellMar>
-        </w:tblPrEx>
         <w:tc>
           <w:tcPr>
             <w:tcW w:w="1984" w:type="dxa"/>
@@ -2867,12 +2860,6 @@
         </w:tc>
       </w:tr>
       <w:tr>
-        <w:tblPrEx>
-          <w:tblCellMar>
-            <w:top w:w="0" w:type="dxa"/>
-            <w:bottom w:w="0" w:type="dxa"/>
-          </w:tblCellMar>
-        </w:tblPrEx>
         <w:tc>
           <w:tcPr>
             <w:tcW w:w="1984" w:type="dxa"/>
@@ -2997,7 +2984,21 @@
                 <w:sz w:val="20"/>
                 <w:szCs w:val="20"/>
               </w:rPr>
+              <w:t>“</w:t>
+            </w:r>
+            <w:r>
+              <w:rPr>
+                <w:sz w:val="20"/>
+                <w:szCs w:val="20"/>
+              </w:rPr>
               <w:t>L</w:t>
+            </w:r>
+            <w:r>
+              <w:rPr>
+                <w:sz w:val="20"/>
+                <w:szCs w:val="20"/>
+              </w:rPr>
+              <w:t>”</w:t>
             </w:r>
           </w:p>
         </w:tc>
@@ -3030,7 +3031,31 @@
                 <w:szCs w:val="20"/>
                 <w:lang w:val="es-AR"/>
               </w:rPr>
-              <w:t>Categoría más frecuente: tipo L</w:t>
+              <w:t xml:space="preserve">Categoría más frecuente: tipo </w:t>
+            </w:r>
+            <w:r>
+              <w:rPr>
+                <w:sz w:val="20"/>
+                <w:szCs w:val="20"/>
+                <w:lang w:val="es-AR"/>
+              </w:rPr>
+              <w:t>“</w:t>
+            </w:r>
+            <w:r>
+              <w:rPr>
+                <w:sz w:val="20"/>
+                <w:szCs w:val="20"/>
+                <w:lang w:val="es-AR"/>
+              </w:rPr>
+              <w:t>L</w:t>
+            </w:r>
+            <w:r>
+              <w:rPr>
+                <w:sz w:val="20"/>
+                <w:szCs w:val="20"/>
+                <w:lang w:val="es-AR"/>
+              </w:rPr>
+              <w:t>”</w:t>
             </w:r>
             <w:r>
               <w:rPr>
@@ -3044,12 +3069,6 @@
         </w:tc>
       </w:tr>
       <w:tr>
-        <w:tblPrEx>
-          <w:tblCellMar>
-            <w:top w:w="0" w:type="dxa"/>
-            <w:bottom w:w="0" w:type="dxa"/>
-          </w:tblCellMar>
-        </w:tblPrEx>
         <w:tc>
           <w:tcPr>
             <w:tcW w:w="1984" w:type="dxa"/>
@@ -3172,7 +3191,21 @@
                 <w:sz w:val="20"/>
                 <w:szCs w:val="20"/>
               </w:rPr>
+              <w:t>“</w:t>
+            </w:r>
+            <w:r>
+              <w:rPr>
+                <w:sz w:val="20"/>
+                <w:szCs w:val="20"/>
+              </w:rPr>
               <w:t>failure</w:t>
+            </w:r>
+            <w:r>
+              <w:rPr>
+                <w:sz w:val="20"/>
+                <w:szCs w:val="20"/>
+              </w:rPr>
+              <w:t>”</w:t>
             </w:r>
           </w:p>
         </w:tc>
@@ -3215,14 +3248,16 @@
               </w:rPr>
               <w:t>“</w:t>
             </w:r>
+            <w:proofErr w:type="spellStart"/>
             <w:r>
               <w:rPr>
                 <w:sz w:val="20"/>
                 <w:szCs w:val="20"/>
                 <w:lang w:val="es-AR"/>
               </w:rPr>
-              <w:t>falla</w:t>
-            </w:r>
+              <w:t>failure</w:t>
+            </w:r>
+            <w:proofErr w:type="spellEnd"/>
             <w:r>
               <w:rPr>
                 <w:sz w:val="20"/>
@@ -3492,12 +3527,6 @@
         <w:gridCol w:w="1000"/>
       </w:tblGrid>
       <w:tr>
-        <w:tblPrEx>
-          <w:tblCellMar>
-            <w:top w:w="0" w:type="dxa"/>
-            <w:bottom w:w="0" w:type="dxa"/>
-          </w:tblCellMar>
-        </w:tblPrEx>
         <w:trPr>
           <w:tblHeader/>
         </w:trPr>
@@ -3701,12 +3730,6 @@
         </w:tc>
       </w:tr>
       <w:tr>
-        <w:tblPrEx>
-          <w:tblCellMar>
-            <w:top w:w="0" w:type="dxa"/>
-            <w:bottom w:w="0" w:type="dxa"/>
-          </w:tblCellMar>
-        </w:tblPrEx>
         <w:tc>
           <w:tcPr>
             <w:tcW w:w="1984" w:type="dxa"/>
@@ -3907,12 +3930,6 @@
         </w:tc>
       </w:tr>
       <w:tr>
-        <w:tblPrEx>
-          <w:tblCellMar>
-            <w:top w:w="0" w:type="dxa"/>
-            <w:bottom w:w="0" w:type="dxa"/>
-          </w:tblCellMar>
-        </w:tblPrEx>
         <w:tc>
           <w:tcPr>
             <w:tcW w:w="1984" w:type="dxa"/>
@@ -4156,12 +4173,6 @@
         </w:tc>
       </w:tr>
       <w:tr>
-        <w:tblPrEx>
-          <w:tblCellMar>
-            <w:top w:w="0" w:type="dxa"/>
-            <w:bottom w:w="0" w:type="dxa"/>
-          </w:tblCellMar>
-        </w:tblPrEx>
         <w:tc>
           <w:tcPr>
             <w:tcW w:w="1984" w:type="dxa"/>
@@ -4355,12 +4366,6 @@
         </w:tc>
       </w:tr>
       <w:tr>
-        <w:tblPrEx>
-          <w:tblCellMar>
-            <w:top w:w="0" w:type="dxa"/>
-            <w:bottom w:w="0" w:type="dxa"/>
-          </w:tblCellMar>
-        </w:tblPrEx>
         <w:tc>
           <w:tcPr>
             <w:tcW w:w="1984" w:type="dxa"/>
@@ -4550,12 +4555,6 @@
         </w:tc>
       </w:tr>
       <w:tr>
-        <w:tblPrEx>
-          <w:tblCellMar>
-            <w:top w:w="0" w:type="dxa"/>
-            <w:bottom w:w="0" w:type="dxa"/>
-          </w:tblCellMar>
-        </w:tblPrEx>
         <w:tc>
           <w:tcPr>
             <w:tcW w:w="1984" w:type="dxa"/>
@@ -4925,7 +4924,19 @@
         <w:rPr>
           <w:lang w:val="es-AR"/>
         </w:rPr>
-        <w:t>istribución multimodal con pico principal en ~302 K. Rango acotado entre 295 K y 304.5 K sin valores atípicos. La multimodalidad puede reflejar distintas condiciones ambientales o turnos de trabajo.</w:t>
+        <w:t>istribución multimodal con pico principal en ~302 K. Rango acotado entre 295 K y 304</w:t>
+      </w:r>
+      <w:r>
+        <w:rPr>
+          <w:lang w:val="es-AR"/>
+        </w:rPr>
+        <w:t>,</w:t>
+      </w:r>
+      <w:r>
+        <w:rPr>
+          <w:lang w:val="es-AR"/>
+        </w:rPr>
+        <w:t>5 K sin valores atípicos. La multimodalidad puede reflejar distintas condiciones ambientales o turnos de trabajo.</w:t>
       </w:r>
     </w:p>
     <w:p>
@@ -5282,7 +5293,7 @@
         <w:rPr>
           <w:lang w:val="es-AR"/>
         </w:rPr>
-        <w:t>uerte concentración en ~1500 RPM con sesgo marcado hacia la derecha. Se identifica un grupo secundario en ~2700 RPM y presencia de valores cercanos a 0 (errores de sensor, tratados posteriormente). A partir de 2500 RPM se concentran casos de falla.</w:t>
+        <w:t xml:space="preserve">uerte concentración en ~1500 RPM con sesgo marcado hacia la derecha. Se identifica un grupo secundario en ~2700 RPM y presencia de valores cercanos a 0 (errores de sensor, tratados posteriormente). </w:t>
       </w:r>
     </w:p>
     <w:p>
@@ -5441,7 +5452,7 @@
         <w:rPr>
           <w:lang w:val="es-AR"/>
         </w:rPr>
-        <w:t>istribución aproximadamente simétrica centrada en ~50 Nm, con una agrupación secundaria en ~12 Nm. Valores por debajo de 10 Nm o por encima de 70 Nm se asocian a alta probabilidad de falla.</w:t>
+        <w:t xml:space="preserve">istribución aproximadamente simétrica centrada en ~50 Nm, con una agrupación secundaria en ~12 Nm. </w:t>
       </w:r>
     </w:p>
     <w:p>
@@ -5600,7 +5611,7 @@
         <w:rPr>
           <w:lang w:val="es-AR"/>
         </w:rPr>
-        <w:t>210 minutos. Este pico indica una zona crítica donde el desgaste acumulado desencadena fallas con mayor frecuencia.</w:t>
+        <w:t xml:space="preserve">210 minutos. </w:t>
       </w:r>
     </w:p>
     <w:p>
@@ -5609,7 +5620,9 @@
         <w:jc w:val="center"/>
       </w:pPr>
       <w:r>
-        <w:lastRenderedPageBreak/>
+        <w:rPr>
+          <w:noProof/>
+        </w:rPr>
         <w:drawing>
           <wp:inline distT="0" distB="0" distL="0" distR="0" wp14:anchorId="02778704" wp14:editId="1ABCF910">
             <wp:extent cx="4328160" cy="3208809"/>
@@ -5682,6 +5695,7 @@
           <w:szCs w:val="20"/>
           <w:lang w:val="es-AR"/>
         </w:rPr>
+        <w:lastRenderedPageBreak/>
         <w:t>Figura 5</w:t>
       </w:r>
       <w:r>
@@ -5766,7 +5780,127 @@
         <w:rPr>
           <w:lang w:val="es-AR"/>
         </w:rPr>
-        <w:t>arcado desbalance: tipo L &gt; 10.000 registros; tipo M ~2.800; tipo H ~1.500. El tipo L representa la mayoría de la producción.</w:t>
+        <w:t xml:space="preserve">arcado desbalance: tipo </w:t>
+      </w:r>
+      <w:r>
+        <w:rPr>
+          <w:lang w:val="es-AR"/>
+        </w:rPr>
+        <w:t>“</w:t>
+      </w:r>
+      <w:r>
+        <w:rPr>
+          <w:lang w:val="es-AR"/>
+        </w:rPr>
+        <w:t>L</w:t>
+      </w:r>
+      <w:r>
+        <w:rPr>
+          <w:lang w:val="es-AR"/>
+        </w:rPr>
+        <w:t>”</w:t>
+      </w:r>
+      <w:r>
+        <w:rPr>
+          <w:lang w:val="es-AR"/>
+        </w:rPr>
+        <w:t xml:space="preserve"> &gt; 10.000 registros; tipo </w:t>
+      </w:r>
+      <w:r>
+        <w:rPr>
+          <w:lang w:val="es-AR"/>
+        </w:rPr>
+        <w:t>“</w:t>
+      </w:r>
+      <w:r>
+        <w:rPr>
+          <w:lang w:val="es-AR"/>
+        </w:rPr>
+        <w:t>M</w:t>
+      </w:r>
+      <w:r>
+        <w:rPr>
+          <w:lang w:val="es-AR"/>
+        </w:rPr>
+        <w:t>”</w:t>
+      </w:r>
+      <w:r>
+        <w:rPr>
+          <w:lang w:val="es-AR"/>
+        </w:rPr>
+        <w:t xml:space="preserve"> ~2.800</w:t>
+      </w:r>
+      <w:r>
+        <w:rPr>
+          <w:lang w:val="es-AR"/>
+        </w:rPr>
+        <w:t xml:space="preserve"> registros</w:t>
+      </w:r>
+      <w:r>
+        <w:rPr>
+          <w:lang w:val="es-AR"/>
+        </w:rPr>
+        <w:t xml:space="preserve">; tipo </w:t>
+      </w:r>
+      <w:r>
+        <w:rPr>
+          <w:lang w:val="es-AR"/>
+        </w:rPr>
+        <w:t>“</w:t>
+      </w:r>
+      <w:r>
+        <w:rPr>
+          <w:lang w:val="es-AR"/>
+        </w:rPr>
+        <w:t>H</w:t>
+      </w:r>
+      <w:r>
+        <w:rPr>
+          <w:lang w:val="es-AR"/>
+        </w:rPr>
+        <w:t>”</w:t>
+      </w:r>
+      <w:r>
+        <w:rPr>
+          <w:lang w:val="es-AR"/>
+        </w:rPr>
+        <w:t xml:space="preserve"> ~1.500</w:t>
+      </w:r>
+      <w:r>
+        <w:rPr>
+          <w:lang w:val="es-AR"/>
+        </w:rPr>
+        <w:t xml:space="preserve"> registros</w:t>
+      </w:r>
+      <w:r>
+        <w:rPr>
+          <w:lang w:val="es-AR"/>
+        </w:rPr>
+        <w:t xml:space="preserve">. El tipo </w:t>
+      </w:r>
+      <w:r>
+        <w:rPr>
+          <w:lang w:val="es-AR"/>
+        </w:rPr>
+        <w:t>“</w:t>
+      </w:r>
+      <w:r>
+        <w:rPr>
+          <w:lang w:val="es-AR"/>
+        </w:rPr>
+        <w:t>L</w:t>
+      </w:r>
+      <w:r>
+        <w:rPr>
+          <w:lang w:val="es-AR"/>
+        </w:rPr>
+        <w:t>”</w:t>
+      </w:r>
+      <w:r>
+        <w:rPr>
+          <w:lang w:val="es-AR"/>
+        </w:rPr>
+        <w:t xml:space="preserve"> representa la mayoría de la producción.</w:t>
       </w:r>
     </w:p>
     <w:p>
@@ -5775,6 +5909,9 @@
         <w:jc w:val="center"/>
       </w:pPr>
       <w:r>
+        <w:rPr>
+          <w:noProof/>
+        </w:rPr>
         <w:drawing>
           <wp:inline distT="0" distB="0" distL="0" distR="0" wp14:anchorId="7CB90429" wp14:editId="49EDFB98">
             <wp:extent cx="4191000" cy="3123727"/>
@@ -5955,7 +6092,19 @@
         <w:rPr>
           <w:lang w:val="es-AR"/>
         </w:rPr>
-        <w:t xml:space="preserve"> (~7.400) sobre </w:t>
+        <w:t xml:space="preserve"> (~7.400</w:t>
+      </w:r>
+      <w:r>
+        <w:rPr>
+          <w:lang w:val="es-AR"/>
+        </w:rPr>
+        <w:t xml:space="preserve"> registros</w:t>
+      </w:r>
+      <w:r>
+        <w:rPr>
+          <w:lang w:val="es-AR"/>
+        </w:rPr>
+        <w:t xml:space="preserve">) sobre </w:t>
       </w:r>
       <w:r>
         <w:rPr>
@@ -5979,21 +6128,19 @@
         <w:rPr>
           <w:lang w:val="es-AR"/>
         </w:rPr>
-        <w:t xml:space="preserve"> (~7.000). El desbalance moderado fue tratado con </w:t>
-      </w:r>
-      <w:proofErr w:type="spellStart"/>
-      <w:r>
-        <w:rPr>
-          <w:lang w:val="es-AR"/>
-        </w:rPr>
-        <w:t>over-sampling</w:t>
-      </w:r>
-      <w:proofErr w:type="spellEnd"/>
-      <w:r>
-        <w:rPr>
-          <w:lang w:val="es-AR"/>
-        </w:rPr>
-        <w:t>.</w:t>
+        <w:t xml:space="preserve"> (~7.000</w:t>
+      </w:r>
+      <w:r>
+        <w:rPr>
+          <w:lang w:val="es-AR"/>
+        </w:rPr>
+        <w:t xml:space="preserve"> registros</w:t>
+      </w:r>
+      <w:r>
+        <w:rPr>
+          <w:lang w:val="es-AR"/>
+        </w:rPr>
+        <w:t xml:space="preserve">). </w:t>
       </w:r>
     </w:p>
     <w:p>
@@ -6002,7 +6149,9 @@
         <w:jc w:val="center"/>
       </w:pPr>
       <w:r>
-        <w:lastRenderedPageBreak/>
+        <w:rPr>
+          <w:noProof/>
+        </w:rPr>
         <w:drawing>
           <wp:inline distT="0" distB="0" distL="0" distR="0" wp14:anchorId="1DDCF9A4" wp14:editId="34E47D58">
             <wp:extent cx="4267200" cy="3186363"/>
@@ -6113,26 +6262,18 @@
     <w:p>
       <w:pPr>
         <w:pStyle w:val="Ttulo2"/>
+        <w:spacing w:before="0"/>
         <w:rPr>
           <w:color w:val="auto"/>
           <w:lang w:val="es-AR"/>
         </w:rPr>
       </w:pPr>
-    </w:p>
-    <w:p>
-      <w:pPr>
-        <w:pStyle w:val="Ttulo2"/>
-        <w:spacing w:before="0"/>
+      <w:r>
         <w:rPr>
           <w:color w:val="auto"/>
           <w:lang w:val="es-AR"/>
         </w:rPr>
-      </w:pPr>
-      <w:r>
-        <w:rPr>
-          <w:color w:val="auto"/>
-          <w:lang w:val="es-AR"/>
-        </w:rPr>
+        <w:lastRenderedPageBreak/>
         <w:t>3.4 Proporciones</w:t>
       </w:r>
     </w:p>
@@ -6160,6 +6301,7 @@
       </w:pPr>
       <w:r>
         <w:rPr>
+          <w:noProof/>
           <w:lang w:val="es-AR"/>
         </w:rPr>
         <w:drawing>
@@ -6314,9 +6456,29 @@
       </w:r>
       <w:r>
         <w:rPr>
-          <w:lang w:val="es-AR"/>
-        </w:rPr>
-        <w:t>L representa el 7</w:t>
+          <w:b/>
+          <w:bCs/>
+          <w:lang w:val="es-AR"/>
+        </w:rPr>
+        <w:t>“</w:t>
+      </w:r>
+      <w:r>
+        <w:rPr>
+          <w:lang w:val="es-AR"/>
+        </w:rPr>
+        <w:t>L</w:t>
+      </w:r>
+      <w:r>
+        <w:rPr>
+          <w:lang w:val="es-AR"/>
+        </w:rPr>
+        <w:t>”</w:t>
+      </w:r>
+      <w:r>
+        <w:rPr>
+          <w:lang w:val="es-AR"/>
+        </w:rPr>
+        <w:t xml:space="preserve"> representa el 7</w:t>
       </w:r>
       <w:r>
         <w:rPr>
@@ -6328,7 +6490,31 @@
         <w:rPr>
           <w:lang w:val="es-AR"/>
         </w:rPr>
-        <w:t>4% del total, M el 1</w:t>
+        <w:t xml:space="preserve">4% del total, </w:t>
+      </w:r>
+      <w:r>
+        <w:rPr>
+          <w:lang w:val="es-AR"/>
+        </w:rPr>
+        <w:t>“</w:t>
+      </w:r>
+      <w:r>
+        <w:rPr>
+          <w:lang w:val="es-AR"/>
+        </w:rPr>
+        <w:t>M</w:t>
+      </w:r>
+      <w:r>
+        <w:rPr>
+          <w:lang w:val="es-AR"/>
+        </w:rPr>
+        <w:t>”</w:t>
+      </w:r>
+      <w:r>
+        <w:rPr>
+          <w:lang w:val="es-AR"/>
+        </w:rPr>
+        <w:t xml:space="preserve"> el 1</w:t>
       </w:r>
       <w:r>
         <w:rPr>
@@ -6340,7 +6526,31 @@
         <w:rPr>
           <w:lang w:val="es-AR"/>
         </w:rPr>
-        <w:t xml:space="preserve">% y H el </w:t>
+        <w:t xml:space="preserve">% y </w:t>
+      </w:r>
+      <w:r>
+        <w:rPr>
+          <w:lang w:val="es-AR"/>
+        </w:rPr>
+        <w:t>“</w:t>
+      </w:r>
+      <w:r>
+        <w:rPr>
+          <w:lang w:val="es-AR"/>
+        </w:rPr>
+        <w:t>H</w:t>
+      </w:r>
+      <w:r>
+        <w:rPr>
+          <w:lang w:val="es-AR"/>
+        </w:rPr>
+        <w:t>”</w:t>
+      </w:r>
+      <w:r>
+        <w:rPr>
+          <w:lang w:val="es-AR"/>
+        </w:rPr>
+        <w:t xml:space="preserve"> el </w:t>
       </w:r>
       <w:r>
         <w:rPr>
@@ -6393,7 +6603,6 @@
           <w:bCs/>
           <w:lang w:val="es-AR"/>
         </w:rPr>
-        <w:lastRenderedPageBreak/>
         <w:t xml:space="preserve">Proporción de </w:t>
       </w:r>
       <w:proofErr w:type="gramStart"/>
@@ -6418,7 +6627,13 @@
         <w:rPr>
           <w:lang w:val="es-AR"/>
         </w:rPr>
-        <w:t>51.</w:t>
+        <w:t>51</w:t>
+      </w:r>
+      <w:r>
+        <w:rPr>
+          <w:lang w:val="es-AR"/>
+        </w:rPr>
+        <w:t>,</w:t>
       </w:r>
       <w:r>
         <w:rPr>
@@ -6430,7 +6645,13 @@
         <w:rPr>
           <w:lang w:val="es-AR"/>
         </w:rPr>
-        <w:t>% de los registros corresponden a fallas y 48.</w:t>
+        <w:t>% de los registros corresponden a fallas y 48</w:t>
+      </w:r>
+      <w:r>
+        <w:rPr>
+          <w:lang w:val="es-AR"/>
+        </w:rPr>
+        <w:t>,</w:t>
       </w:r>
       <w:r>
         <w:rPr>
@@ -6476,20 +6697,145 @@
         </w:rPr>
         <w:t xml:space="preserve"> más adelante).</w:t>
       </w:r>
-    </w:p>
-    <w:p>
-      <w:pPr>
-        <w:spacing w:after="60"/>
-        <w:rPr>
-          <w:lang w:val="es-AR"/>
-        </w:rPr>
-      </w:pPr>
     </w:p>
     <w:p>
       <w:pPr>
         <w:spacing w:after="100"/>
         <w:jc w:val="both"/>
         <w:rPr>
+          <w:lang w:val="es-AR"/>
+        </w:rPr>
+      </w:pPr>
+    </w:p>
+    <w:p>
+      <w:pPr>
+        <w:spacing w:after="100"/>
+        <w:jc w:val="center"/>
+        <w:rPr>
+          <w:lang w:val="es-AR"/>
+        </w:rPr>
+      </w:pPr>
+      <w:r>
+        <w:rPr>
+          <w:lang w:val="es-AR"/>
+        </w:rPr>
+        <w:drawing>
+          <wp:inline distT="0" distB="0" distL="0" distR="0" wp14:anchorId="5FF5D70D" wp14:editId="1894D337">
+            <wp:extent cx="5137847" cy="3162300"/>
+            <wp:effectExtent l="0" t="0" r="5715" b="0"/>
+            <wp:docPr id="175387284" name="Imagen 1"/>
+            <wp:cNvGraphicFramePr>
+              <a:graphicFrameLocks xmlns:a="http://schemas.openxmlformats.org/drawingml/2006/main" noChangeAspect="1"/>
+            </wp:cNvGraphicFramePr>
+            <a:graphic xmlns:a="http://schemas.openxmlformats.org/drawingml/2006/main">
+              <a:graphicData uri="http://schemas.openxmlformats.org/drawingml/2006/picture">
+                <pic:pic xmlns:pic="http://schemas.openxmlformats.org/drawingml/2006/picture">
+                  <pic:nvPicPr>
+                    <pic:cNvPr id="175387284" name=""/>
+                    <pic:cNvPicPr/>
+                  </pic:nvPicPr>
+                  <pic:blipFill>
+                    <a:blip r:embed="rId15"/>
+                    <a:stretch>
+                      <a:fillRect/>
+                    </a:stretch>
+                  </pic:blipFill>
+                  <pic:spPr>
+                    <a:xfrm>
+                      <a:off x="0" y="0"/>
+                      <a:ext cx="5147867" cy="3168467"/>
+                    </a:xfrm>
+                    <a:prstGeom prst="rect">
+                      <a:avLst/>
+                    </a:prstGeom>
+                  </pic:spPr>
+                </pic:pic>
+              </a:graphicData>
+            </a:graphic>
+          </wp:inline>
+        </w:drawing>
+      </w:r>
+    </w:p>
+    <w:p>
+      <w:pPr>
+        <w:spacing w:before="240" w:after="60"/>
+        <w:jc w:val="center"/>
+        <w:rPr>
+          <w:i/>
+          <w:iCs/>
+          <w:sz w:val="20"/>
+          <w:szCs w:val="20"/>
+          <w:lang w:val="es-AR"/>
+        </w:rPr>
+      </w:pPr>
+      <w:r>
+        <w:rPr>
+          <w:b/>
+          <w:bCs/>
+          <w:i/>
+          <w:iCs/>
+          <w:sz w:val="20"/>
+          <w:szCs w:val="20"/>
+          <w:lang w:val="es-AR"/>
+        </w:rPr>
+        <w:lastRenderedPageBreak/>
+        <w:t xml:space="preserve">Figura </w:t>
+      </w:r>
+      <w:r>
+        <w:rPr>
+          <w:b/>
+          <w:bCs/>
+          <w:i/>
+          <w:iCs/>
+          <w:sz w:val="20"/>
+          <w:szCs w:val="20"/>
+          <w:lang w:val="es-AR"/>
+        </w:rPr>
+        <w:t>9</w:t>
+      </w:r>
+      <w:r>
+        <w:rPr>
+          <w:i/>
+          <w:iCs/>
+          <w:sz w:val="20"/>
+          <w:szCs w:val="20"/>
+          <w:lang w:val="es-AR"/>
+        </w:rPr>
+        <w:t xml:space="preserve">: </w:t>
+      </w:r>
+      <w:r>
+        <w:rPr>
+          <w:i/>
+          <w:iCs/>
+          <w:sz w:val="20"/>
+          <w:szCs w:val="20"/>
+          <w:lang w:val="es-AR"/>
+        </w:rPr>
+        <w:t>Distribución de fallas por tipo de producto.</w:t>
+      </w:r>
+    </w:p>
+    <w:p>
+      <w:pPr>
+        <w:spacing w:after="100"/>
+        <w:jc w:val="center"/>
+        <w:rPr>
+          <w:lang w:val="es-AR"/>
+        </w:rPr>
+      </w:pPr>
+    </w:p>
+    <w:p>
+      <w:pPr>
+        <w:spacing w:after="60"/>
+        <w:rPr>
+          <w:lang w:val="es-AR"/>
+        </w:rPr>
+      </w:pPr>
+    </w:p>
+    <w:p>
+      <w:pPr>
+        <w:spacing w:after="100"/>
+        <w:jc w:val="both"/>
+        <w:rPr>
           <w:color w:val="EE0000"/>
           <w:lang w:val="es-AR"/>
         </w:rPr>
@@ -6505,13 +6851,6 @@
           <w:lang w:val="es-AR"/>
         </w:rPr>
         <w:t xml:space="preserve"> </w:t>
-      </w:r>
-      <w:r>
-        <w:rPr>
-          <w:color w:val="EE0000"/>
-          <w:lang w:val="es-AR"/>
-        </w:rPr>
-        <w:t>A CHEQUEAR CON PYTHON</w:t>
       </w:r>
     </w:p>
     <w:tbl>
@@ -6532,24 +6871,18 @@
         <w:tblLook w:val="0000" w:firstRow="0" w:lastRow="0" w:firstColumn="0" w:lastColumn="0" w:noHBand="0" w:noVBand="0"/>
       </w:tblPr>
       <w:tblGrid>
-        <w:gridCol w:w="2340"/>
-        <w:gridCol w:w="2340"/>
-        <w:gridCol w:w="2340"/>
-        <w:gridCol w:w="2340"/>
+        <w:gridCol w:w="1984"/>
+        <w:gridCol w:w="1701"/>
+        <w:gridCol w:w="1701"/>
+        <w:gridCol w:w="3974"/>
       </w:tblGrid>
       <w:tr>
-        <w:tblPrEx>
-          <w:tblCellMar>
-            <w:top w:w="0" w:type="dxa"/>
-            <w:bottom w:w="0" w:type="dxa"/>
-          </w:tblCellMar>
-        </w:tblPrEx>
         <w:trPr>
           <w:tblHeader/>
         </w:trPr>
         <w:tc>
           <w:tcPr>
-            <w:tcW w:w="2340" w:type="dxa"/>
+            <w:tcW w:w="1984" w:type="dxa"/>
             <w:tcBorders>
               <w:top w:val="single" w:sz="1" w:space="0" w:color="CCCCCC"/>
               <w:left w:val="single" w:sz="1" w:space="0" w:color="CCCCCC"/>
@@ -6602,7 +6935,7 @@
         </w:tc>
         <w:tc>
           <w:tcPr>
-            <w:tcW w:w="2340" w:type="dxa"/>
+            <w:tcW w:w="1701" w:type="dxa"/>
             <w:tcBorders>
               <w:top w:val="single" w:sz="1" w:space="0" w:color="CCCCCC"/>
               <w:left w:val="single" w:sz="1" w:space="0" w:color="CCCCCC"/>
@@ -6635,7 +6968,7 @@
         </w:tc>
         <w:tc>
           <w:tcPr>
-            <w:tcW w:w="2340" w:type="dxa"/>
+            <w:tcW w:w="1701" w:type="dxa"/>
             <w:tcBorders>
               <w:top w:val="single" w:sz="1" w:space="0" w:color="CCCCCC"/>
               <w:left w:val="single" w:sz="1" w:space="0" w:color="CCCCCC"/>
@@ -6668,7 +7001,7 @@
         </w:tc>
         <w:tc>
           <w:tcPr>
-            <w:tcW w:w="2340" w:type="dxa"/>
+            <w:tcW w:w="3974" w:type="dxa"/>
             <w:tcBorders>
               <w:top w:val="single" w:sz="1" w:space="0" w:color="CCCCCC"/>
               <w:left w:val="single" w:sz="1" w:space="0" w:color="CCCCCC"/>
@@ -6703,15 +7036,9 @@
         </w:tc>
       </w:tr>
       <w:tr>
-        <w:tblPrEx>
-          <w:tblCellMar>
-            <w:top w:w="0" w:type="dxa"/>
-            <w:bottom w:w="0" w:type="dxa"/>
-          </w:tblCellMar>
-        </w:tblPrEx>
-        <w:tc>
-          <w:tcPr>
-            <w:tcW w:w="2340" w:type="dxa"/>
+        <w:tc>
+          <w:tcPr>
+            <w:tcW w:w="1984" w:type="dxa"/>
             <w:tcBorders>
               <w:top w:val="single" w:sz="4" w:space="0" w:color="000000"/>
               <w:left w:val="single" w:sz="4" w:space="0" w:color="000000"/>
@@ -6747,7 +7074,7 @@
         </w:tc>
         <w:tc>
           <w:tcPr>
-            <w:tcW w:w="2340" w:type="dxa"/>
+            <w:tcW w:w="1701" w:type="dxa"/>
             <w:tcBorders>
               <w:top w:val="single" w:sz="4" w:space="0" w:color="000000"/>
               <w:left w:val="single" w:sz="4" w:space="0" w:color="000000"/>
@@ -6771,13 +7098,20 @@
                 <w:sz w:val="20"/>
                 <w:szCs w:val="20"/>
               </w:rPr>
-              <w:t>~51%</w:t>
-            </w:r>
-          </w:p>
-        </w:tc>
-        <w:tc>
-          <w:tcPr>
-            <w:tcW w:w="2340" w:type="dxa"/>
+              <w:t>5</w:t>
+            </w:r>
+            <w:r>
+              <w:rPr>
+                <w:sz w:val="20"/>
+                <w:szCs w:val="20"/>
+              </w:rPr>
+              <w:t>9,83</w:t>
+            </w:r>
+          </w:p>
+        </w:tc>
+        <w:tc>
+          <w:tcPr>
+            <w:tcW w:w="1701" w:type="dxa"/>
             <w:tcBorders>
               <w:top w:val="single" w:sz="4" w:space="0" w:color="000000"/>
               <w:left w:val="single" w:sz="4" w:space="0" w:color="000000"/>
@@ -6801,13 +7135,13 @@
                 <w:sz w:val="20"/>
                 <w:szCs w:val="20"/>
               </w:rPr>
-              <w:t>~49%</w:t>
-            </w:r>
-          </w:p>
-        </w:tc>
-        <w:tc>
-          <w:tcPr>
-            <w:tcW w:w="2340" w:type="dxa"/>
+              <w:t>40,17</w:t>
+            </w:r>
+          </w:p>
+        </w:tc>
+        <w:tc>
+          <w:tcPr>
+            <w:tcW w:w="3974" w:type="dxa"/>
             <w:tcBorders>
               <w:top w:val="single" w:sz="4" w:space="0" w:color="000000"/>
               <w:left w:val="single" w:sz="4" w:space="0" w:color="000000"/>
@@ -6834,21 +7168,15 @@
                 <w:szCs w:val="20"/>
                 <w:lang w:val="es-AR"/>
               </w:rPr>
-              <w:t>Tasa de falla similar a la media global</w:t>
+              <w:t>Mayor tasa de fallas del conjunto. Al ser el tipo más producido, concentra la mayoría de las fallas totales del sistema.</w:t>
             </w:r>
           </w:p>
         </w:tc>
       </w:tr>
       <w:tr>
-        <w:tblPrEx>
-          <w:tblCellMar>
-            <w:top w:w="0" w:type="dxa"/>
-            <w:bottom w:w="0" w:type="dxa"/>
-          </w:tblCellMar>
-        </w:tblPrEx>
-        <w:tc>
-          <w:tcPr>
-            <w:tcW w:w="2340" w:type="dxa"/>
+        <w:tc>
+          <w:tcPr>
+            <w:tcW w:w="1984" w:type="dxa"/>
             <w:tcBorders>
               <w:top w:val="single" w:sz="4" w:space="0" w:color="000000"/>
               <w:left w:val="single" w:sz="4" w:space="0" w:color="000000"/>
@@ -6884,7 +7212,7 @@
         </w:tc>
         <w:tc>
           <w:tcPr>
-            <w:tcW w:w="2340" w:type="dxa"/>
+            <w:tcW w:w="1701" w:type="dxa"/>
             <w:tcBorders>
               <w:top w:val="single" w:sz="4" w:space="0" w:color="000000"/>
               <w:left w:val="single" w:sz="4" w:space="0" w:color="000000"/>
@@ -6908,13 +7236,13 @@
                 <w:sz w:val="20"/>
                 <w:szCs w:val="20"/>
               </w:rPr>
-              <w:t>~52%</w:t>
-            </w:r>
-          </w:p>
-        </w:tc>
-        <w:tc>
-          <w:tcPr>
-            <w:tcW w:w="2340" w:type="dxa"/>
+              <w:t>20,4</w:t>
+            </w:r>
+          </w:p>
+        </w:tc>
+        <w:tc>
+          <w:tcPr>
+            <w:tcW w:w="1701" w:type="dxa"/>
             <w:tcBorders>
               <w:top w:val="single" w:sz="4" w:space="0" w:color="000000"/>
               <w:left w:val="single" w:sz="4" w:space="0" w:color="000000"/>
@@ -6938,13 +7266,13 @@
                 <w:sz w:val="20"/>
                 <w:szCs w:val="20"/>
               </w:rPr>
-              <w:t>~48%</w:t>
-            </w:r>
-          </w:p>
-        </w:tc>
-        <w:tc>
-          <w:tcPr>
-            <w:tcW w:w="2340" w:type="dxa"/>
+              <w:t>79,6</w:t>
+            </w:r>
+          </w:p>
+        </w:tc>
+        <w:tc>
+          <w:tcPr>
+            <w:tcW w:w="3974" w:type="dxa"/>
             <w:tcBorders>
               <w:top w:val="single" w:sz="4" w:space="0" w:color="000000"/>
               <w:left w:val="single" w:sz="4" w:space="0" w:color="000000"/>
@@ -6971,21 +7299,15 @@
                 <w:szCs w:val="20"/>
                 <w:lang w:val="es-AR"/>
               </w:rPr>
-              <w:t>Tasa de falla levemente mayor que L</w:t>
+              <w:t>El más confiable. Opera mayormente dentro del rango seguro de los sensores.</w:t>
             </w:r>
           </w:p>
         </w:tc>
       </w:tr>
       <w:tr>
-        <w:tblPrEx>
-          <w:tblCellMar>
-            <w:top w:w="0" w:type="dxa"/>
-            <w:bottom w:w="0" w:type="dxa"/>
-          </w:tblCellMar>
-        </w:tblPrEx>
-        <w:tc>
-          <w:tcPr>
-            <w:tcW w:w="2340" w:type="dxa"/>
+        <w:tc>
+          <w:tcPr>
+            <w:tcW w:w="1984" w:type="dxa"/>
             <w:tcBorders>
               <w:top w:val="single" w:sz="4" w:space="0" w:color="000000"/>
               <w:left w:val="single" w:sz="4" w:space="0" w:color="000000"/>
@@ -7021,7 +7343,7 @@
         </w:tc>
         <w:tc>
           <w:tcPr>
-            <w:tcW w:w="2340" w:type="dxa"/>
+            <w:tcW w:w="1701" w:type="dxa"/>
             <w:tcBorders>
               <w:top w:val="single" w:sz="4" w:space="0" w:color="000000"/>
               <w:left w:val="single" w:sz="4" w:space="0" w:color="000000"/>
@@ -7045,13 +7367,13 @@
                 <w:sz w:val="20"/>
                 <w:szCs w:val="20"/>
               </w:rPr>
-              <w:t>~56%</w:t>
-            </w:r>
-          </w:p>
-        </w:tc>
-        <w:tc>
-          <w:tcPr>
-            <w:tcW w:w="2340" w:type="dxa"/>
+              <w:t>49,93</w:t>
+            </w:r>
+          </w:p>
+        </w:tc>
+        <w:tc>
+          <w:tcPr>
+            <w:tcW w:w="1701" w:type="dxa"/>
             <w:tcBorders>
               <w:top w:val="single" w:sz="4" w:space="0" w:color="000000"/>
               <w:left w:val="single" w:sz="4" w:space="0" w:color="000000"/>
@@ -7075,13 +7397,13 @@
                 <w:sz w:val="20"/>
                 <w:szCs w:val="20"/>
               </w:rPr>
-              <w:t>~44%</w:t>
-            </w:r>
-          </w:p>
-        </w:tc>
-        <w:tc>
-          <w:tcPr>
-            <w:tcW w:w="2340" w:type="dxa"/>
+              <w:t>50,07</w:t>
+            </w:r>
+          </w:p>
+        </w:tc>
+        <w:tc>
+          <w:tcPr>
+            <w:tcW w:w="3974" w:type="dxa"/>
             <w:tcBorders>
               <w:top w:val="single" w:sz="4" w:space="0" w:color="000000"/>
               <w:left w:val="single" w:sz="4" w:space="0" w:color="000000"/>
@@ -7097,46 +7419,19 @@
             <w:vAlign w:val="center"/>
           </w:tcPr>
           <w:p>
-            <w:r>
-              <w:rPr>
-                <w:sz w:val="20"/>
-                <w:szCs w:val="20"/>
+            <w:pPr>
+              <w:rPr>
                 <w:lang w:val="es-AR"/>
               </w:rPr>
-              <w:t xml:space="preserve">Mayor tasa de falla relativa. </w:t>
-            </w:r>
-            <w:r>
-              <w:rPr>
-                <w:sz w:val="20"/>
-                <w:szCs w:val="20"/>
-              </w:rPr>
-              <w:t xml:space="preserve">Tipo </w:t>
-            </w:r>
-            <w:proofErr w:type="spellStart"/>
-            <w:r>
-              <w:rPr>
-                <w:sz w:val="20"/>
-                <w:szCs w:val="20"/>
-              </w:rPr>
-              <w:t>más</w:t>
-            </w:r>
-            <w:proofErr w:type="spellEnd"/>
-            <w:r>
-              <w:rPr>
-                <w:sz w:val="20"/>
-                <w:szCs w:val="20"/>
-              </w:rPr>
-              <w:t xml:space="preserve"> </w:t>
-            </w:r>
-            <w:proofErr w:type="spellStart"/>
-            <w:r>
-              <w:rPr>
-                <w:sz w:val="20"/>
-                <w:szCs w:val="20"/>
-              </w:rPr>
-              <w:t>crítico</w:t>
-            </w:r>
-            <w:proofErr w:type="spellEnd"/>
+            </w:pPr>
+            <w:r>
+              <w:rPr>
+                <w:sz w:val="20"/>
+                <w:szCs w:val="20"/>
+                <w:lang w:val="es-AR"/>
+              </w:rPr>
+              <w:t>Comportamiento casi aleatorio (50/50), lo que indica alta sensibilidad a cualquier variación en las condiciones de operación.</w:t>
+            </w:r>
           </w:p>
         </w:tc>
       </w:tr>
@@ -7218,7 +7513,7 @@
         <w:rPr>
           <w:lang w:val="es-AR"/>
         </w:rPr>
-        <w:t>H</w:t>
+        <w:t>L</w:t>
       </w:r>
       <w:r>
         <w:rPr>
@@ -7291,6 +7586,9 @@
         <w:jc w:val="center"/>
       </w:pPr>
       <w:r>
+        <w:rPr>
+          <w:noProof/>
+        </w:rPr>
         <w:lastRenderedPageBreak/>
         <w:drawing>
           <wp:inline distT="0" distB="0" distL="0" distR="0" wp14:anchorId="7B0D6C65" wp14:editId="607E256E">
@@ -7310,7 +7608,7 @@
                     </pic:cNvPicPr>
                   </pic:nvPicPr>
                   <pic:blipFill>
-                    <a:blip r:embed="rId15">
+                    <a:blip r:embed="rId16">
                       <a:extLst>
                         <a:ext uri="{28A0092B-C50C-407E-A947-70E740481C1C}">
                           <a14:useLocalDpi xmlns:a14="http://schemas.microsoft.com/office/drawing/2010/main" val="0"/>
@@ -7439,7 +7737,7 @@
                     </pic:cNvPicPr>
                   </pic:nvPicPr>
                   <pic:blipFill>
-                    <a:blip r:embed="rId16">
+                    <a:blip r:embed="rId17">
                       <a:extLst>
                         <a:ext uri="{28A0092B-C50C-407E-A947-70E740481C1C}">
                           <a14:useLocalDpi xmlns:a14="http://schemas.microsoft.com/office/drawing/2010/main" val="0"/>
@@ -7591,18 +7889,18 @@
       </w:pPr>
       <w:r>
         <w:rPr>
-          <w:b/>
-          <w:bCs/>
-          <w:noProof/>
-          <w:color w:val="000000"/>
-          <w:bdr w:val="none" w:sz="0" w:space="0" w:color="auto" w:frame="1"/>
+          <w:i/>
+          <w:iCs/>
+          <w:sz w:val="20"/>
+          <w:szCs w:val="20"/>
+          <w:lang w:val="es-AR"/>
         </w:rPr>
         <w:lastRenderedPageBreak/>
         <w:drawing>
-          <wp:inline distT="0" distB="0" distL="0" distR="0" wp14:anchorId="73837157" wp14:editId="1460F7FB">
-            <wp:extent cx="1760824" cy="1851660"/>
+          <wp:inline distT="0" distB="0" distL="0" distR="0" wp14:anchorId="2CEC651D" wp14:editId="3CC07075">
+            <wp:extent cx="3817620" cy="2536515"/>
             <wp:effectExtent l="0" t="0" r="0" b="0"/>
-            <wp:docPr id="1453991222" name="Imagen 13"/>
+            <wp:docPr id="228140652" name="Imagen 1"/>
             <wp:cNvGraphicFramePr>
               <a:graphicFrameLocks xmlns:a="http://schemas.openxmlformats.org/drawingml/2006/main" noChangeAspect="1"/>
             </wp:cNvGraphicFramePr>
@@ -7610,41 +7908,23 @@
               <a:graphicData uri="http://schemas.openxmlformats.org/drawingml/2006/picture">
                 <pic:pic xmlns:pic="http://schemas.openxmlformats.org/drawingml/2006/picture">
                   <pic:nvPicPr>
-                    <pic:cNvPr id="0" name="Picture 37"/>
-                    <pic:cNvPicPr>
-                      <a:picLocks noChangeAspect="1" noChangeArrowheads="1"/>
-                    </pic:cNvPicPr>
+                    <pic:cNvPr id="228140652" name=""/>
+                    <pic:cNvPicPr/>
                   </pic:nvPicPr>
-                  <pic:blipFill rotWithShape="1">
-                    <a:blip r:embed="rId17">
-                      <a:extLst>
-                        <a:ext uri="{28A0092B-C50C-407E-A947-70E740481C1C}">
-                          <a14:useLocalDpi xmlns:a14="http://schemas.microsoft.com/office/drawing/2010/main" val="0"/>
-                        </a:ext>
-                      </a:extLst>
-                    </a:blip>
-                    <a:srcRect l="20000"/>
+                  <pic:blipFill>
+                    <a:blip r:embed="rId18"/>
                     <a:stretch>
                       <a:fillRect/>
                     </a:stretch>
                   </pic:blipFill>
-                  <pic:spPr bwMode="auto">
+                  <pic:spPr>
                     <a:xfrm>
                       <a:off x="0" y="0"/>
-                      <a:ext cx="1762671" cy="1853602"/>
+                      <a:ext cx="3826864" cy="2542657"/>
                     </a:xfrm>
                     <a:prstGeom prst="rect">
                       <a:avLst/>
                     </a:prstGeom>
-                    <a:noFill/>
-                    <a:ln>
-                      <a:noFill/>
-                    </a:ln>
-                    <a:extLst>
-                      <a:ext uri="{53640926-AAD7-44D8-BBD7-CCE9431645EC}">
-                        <a14:shadowObscured xmlns:a14="http://schemas.microsoft.com/office/drawing/2010/main"/>
-                      </a:ext>
-                    </a:extLst>
                   </pic:spPr>
                 </pic:pic>
               </a:graphicData>
@@ -7757,17 +8037,17 @@
       </w:pPr>
       <w:r>
         <w:rPr>
-          <w:b/>
-          <w:bCs/>
-          <w:noProof/>
-          <w:color w:val="000000"/>
-          <w:bdr w:val="none" w:sz="0" w:space="0" w:color="auto" w:frame="1"/>
+          <w:i/>
+          <w:iCs/>
+          <w:sz w:val="20"/>
+          <w:szCs w:val="20"/>
+          <w:lang w:val="es-AR"/>
         </w:rPr>
         <w:drawing>
-          <wp:inline distT="0" distB="0" distL="0" distR="0" wp14:anchorId="1E9E8930" wp14:editId="57A9C009">
-            <wp:extent cx="1789239" cy="1859280"/>
-            <wp:effectExtent l="0" t="0" r="1905" b="7620"/>
-            <wp:docPr id="1388350035" name="Imagen 15"/>
+          <wp:inline distT="0" distB="0" distL="0" distR="0" wp14:anchorId="6E829DEB" wp14:editId="36EF375E">
+            <wp:extent cx="4023360" cy="2600569"/>
+            <wp:effectExtent l="0" t="0" r="0" b="9525"/>
+            <wp:docPr id="2052955413" name="Imagen 1"/>
             <wp:cNvGraphicFramePr>
               <a:graphicFrameLocks xmlns:a="http://schemas.openxmlformats.org/drawingml/2006/main" noChangeAspect="1"/>
             </wp:cNvGraphicFramePr>
@@ -7775,36 +8055,23 @@
               <a:graphicData uri="http://schemas.openxmlformats.org/drawingml/2006/picture">
                 <pic:pic xmlns:pic="http://schemas.openxmlformats.org/drawingml/2006/picture">
                   <pic:nvPicPr>
-                    <pic:cNvPr id="0" name="Picture 41"/>
-                    <pic:cNvPicPr>
-                      <a:picLocks noChangeAspect="1" noChangeArrowheads="1"/>
-                    </pic:cNvPicPr>
+                    <pic:cNvPr id="2052955413" name=""/>
+                    <pic:cNvPicPr/>
                   </pic:nvPicPr>
                   <pic:blipFill>
-                    <a:blip r:embed="rId18">
-                      <a:extLst>
-                        <a:ext uri="{28A0092B-C50C-407E-A947-70E740481C1C}">
-                          <a14:useLocalDpi xmlns:a14="http://schemas.microsoft.com/office/drawing/2010/main" val="0"/>
-                        </a:ext>
-                      </a:extLst>
-                    </a:blip>
-                    <a:srcRect/>
+                    <a:blip r:embed="rId19"/>
                     <a:stretch>
                       <a:fillRect/>
                     </a:stretch>
                   </pic:blipFill>
-                  <pic:spPr bwMode="auto">
+                  <pic:spPr>
                     <a:xfrm>
                       <a:off x="0" y="0"/>
-                      <a:ext cx="1790976" cy="1861085"/>
+                      <a:ext cx="4048599" cy="2616883"/>
                     </a:xfrm>
                     <a:prstGeom prst="rect">
                       <a:avLst/>
                     </a:prstGeom>
-                    <a:noFill/>
-                    <a:ln>
-                      <a:noFill/>
-                    </a:ln>
                   </pic:spPr>
                 </pic:pic>
               </a:graphicData>
@@ -7847,21 +8114,158 @@
           <w:szCs w:val="20"/>
           <w:lang w:val="es-AR"/>
         </w:rPr>
-        <w:t>1</w:t>
-      </w:r>
+        <w:t>12</w:t>
+      </w:r>
+      <w:r>
+        <w:rPr>
+          <w:i/>
+          <w:iCs/>
+          <w:sz w:val="20"/>
+          <w:szCs w:val="20"/>
+          <w:lang w:val="es-AR"/>
+        </w:rPr>
+        <w:t xml:space="preserve">: </w:t>
+      </w:r>
+      <w:r>
+        <w:rPr>
+          <w:i/>
+          <w:iCs/>
+          <w:sz w:val="20"/>
+          <w:szCs w:val="20"/>
+          <w:lang w:val="es-AR"/>
+        </w:rPr>
+        <w:t>D</w:t>
+      </w:r>
+      <w:r>
+        <w:rPr>
+          <w:i/>
+          <w:iCs/>
+          <w:sz w:val="20"/>
+          <w:szCs w:val="20"/>
+          <w:lang w:val="es-AR"/>
+        </w:rPr>
+        <w:t xml:space="preserve">istribución de la </w:t>
+      </w:r>
+      <w:r>
+        <w:rPr>
+          <w:i/>
+          <w:iCs/>
+          <w:sz w:val="20"/>
+          <w:szCs w:val="20"/>
+          <w:lang w:val="es-AR"/>
+        </w:rPr>
+        <w:t>velocidad</w:t>
+      </w:r>
+      <w:r>
+        <w:rPr>
+          <w:i/>
+          <w:iCs/>
+          <w:sz w:val="20"/>
+          <w:szCs w:val="20"/>
+          <w:lang w:val="es-AR"/>
+        </w:rPr>
+        <w:t xml:space="preserve"> para ambos estados de operación</w:t>
+      </w:r>
+      <w:r>
+        <w:rPr>
+          <w:i/>
+          <w:iCs/>
+          <w:sz w:val="20"/>
+          <w:szCs w:val="20"/>
+          <w:lang w:val="es-AR"/>
+        </w:rPr>
+        <w:t xml:space="preserve"> (“falla” vs. “normal”).</w:t>
+      </w:r>
+    </w:p>
+    <w:p>
+      <w:pPr>
+        <w:spacing w:after="100"/>
+        <w:rPr>
+          <w:i/>
+          <w:iCs/>
+          <w:sz w:val="20"/>
+          <w:szCs w:val="20"/>
+          <w:lang w:val="es-AR"/>
+        </w:rPr>
+      </w:pPr>
+    </w:p>
+    <w:p>
+      <w:pPr>
+        <w:spacing w:after="100"/>
+        <w:jc w:val="both"/>
+        <w:rPr>
+          <w:lang w:val="es-AR"/>
+        </w:rPr>
+      </w:pPr>
+      <w:proofErr w:type="spellStart"/>
       <w:r>
         <w:rPr>
           <w:b/>
           <w:bCs/>
           <w:i/>
           <w:iCs/>
+          <w:lang w:val="es-AR"/>
+        </w:rPr>
+        <w:t>speed</w:t>
+      </w:r>
+      <w:proofErr w:type="spellEnd"/>
+      <w:r>
+        <w:rPr>
+          <w:b/>
+          <w:bCs/>
+          <w:lang w:val="es-AR"/>
+        </w:rPr>
+        <w:t xml:space="preserve"> (distribución por </w:t>
+      </w:r>
+      <w:proofErr w:type="gramStart"/>
+      <w:r>
+        <w:rPr>
+          <w:b/>
+          <w:bCs/>
+          <w:i/>
+          <w:iCs/>
+          <w:lang w:val="es-AR"/>
+        </w:rPr>
+        <w:t>target</w:t>
+      </w:r>
+      <w:proofErr w:type="gramEnd"/>
+      <w:r>
+        <w:rPr>
+          <w:b/>
+          <w:bCs/>
+          <w:lang w:val="es-AR"/>
+        </w:rPr>
+        <w:t xml:space="preserve">): </w:t>
+      </w:r>
+      <w:r>
+        <w:rPr>
+          <w:lang w:val="es-AR"/>
+        </w:rPr>
+        <w:t>l</w:t>
+      </w:r>
+      <w:r>
+        <w:rPr>
+          <w:lang w:val="es-AR"/>
+        </w:rPr>
+        <w:t>a velocidad también diferencia bien las clases. La operación normal se mantiene estable entre 1200 y 1800 RPM (rango seguro), mientras que las fallas se concentran cerca de 1350 RPM (velocidad ligeramente baja) y en torno a 2700 RPM (velocidad muy alta). Esto indica que el sistema opera con seguridad dentro de un rango intermedio de velocidades.</w:t>
+      </w:r>
+    </w:p>
+    <w:p>
+      <w:pPr>
+        <w:spacing w:after="100"/>
+        <w:rPr>
+          <w:i/>
+          <w:iCs/>
           <w:sz w:val="20"/>
           <w:szCs w:val="20"/>
           <w:lang w:val="es-AR"/>
         </w:rPr>
-        <w:t>2</w:t>
-      </w:r>
-      <w:r>
+      </w:pPr>
+    </w:p>
+    <w:p>
+      <w:pPr>
+        <w:spacing w:after="100"/>
+        <w:jc w:val="center"/>
         <w:rPr>
           <w:i/>
           <w:iCs/>
@@ -7869,8 +8273,7 @@
           <w:szCs w:val="20"/>
           <w:lang w:val="es-AR"/>
         </w:rPr>
-        <w:t xml:space="preserve">: </w:t>
-      </w:r>
+      </w:pPr>
       <w:r>
         <w:rPr>
           <w:i/>
@@ -7879,87 +8282,12 @@
           <w:szCs w:val="20"/>
           <w:lang w:val="es-AR"/>
         </w:rPr>
-        <w:t>D</w:t>
-      </w:r>
-      <w:r>
-        <w:rPr>
-          <w:i/>
-          <w:iCs/>
-          <w:sz w:val="20"/>
-          <w:szCs w:val="20"/>
-          <w:lang w:val="es-AR"/>
-        </w:rPr>
-        <w:t xml:space="preserve">istribución de la </w:t>
-      </w:r>
-      <w:r>
-        <w:rPr>
-          <w:i/>
-          <w:iCs/>
-          <w:sz w:val="20"/>
-          <w:szCs w:val="20"/>
-          <w:lang w:val="es-AR"/>
-        </w:rPr>
-        <w:t>velocidad</w:t>
-      </w:r>
-      <w:r>
-        <w:rPr>
-          <w:i/>
-          <w:iCs/>
-          <w:sz w:val="20"/>
-          <w:szCs w:val="20"/>
-          <w:lang w:val="es-AR"/>
-        </w:rPr>
-        <w:t xml:space="preserve"> para ambos estados de operación</w:t>
-      </w:r>
-      <w:r>
-        <w:rPr>
-          <w:i/>
-          <w:iCs/>
-          <w:sz w:val="20"/>
-          <w:szCs w:val="20"/>
-          <w:lang w:val="es-AR"/>
-        </w:rPr>
-        <w:t xml:space="preserve"> (“falla” vs. “normal”).</w:t>
-      </w:r>
-    </w:p>
-    <w:p>
-      <w:pPr>
-        <w:spacing w:after="100"/>
-        <w:jc w:val="center"/>
-        <w:rPr>
-          <w:i/>
-          <w:iCs/>
-          <w:sz w:val="20"/>
-          <w:szCs w:val="20"/>
-          <w:lang w:val="es-AR"/>
-        </w:rPr>
-      </w:pPr>
-    </w:p>
-    <w:p>
-      <w:pPr>
-        <w:spacing w:after="100"/>
-        <w:jc w:val="center"/>
-        <w:rPr>
-          <w:i/>
-          <w:iCs/>
-          <w:sz w:val="20"/>
-          <w:szCs w:val="20"/>
-          <w:lang w:val="es-AR"/>
-        </w:rPr>
-      </w:pPr>
-      <w:r>
-        <w:rPr>
-          <w:b/>
-          <w:bCs/>
-          <w:noProof/>
-          <w:color w:val="000000"/>
-          <w:bdr w:val="none" w:sz="0" w:space="0" w:color="auto" w:frame="1"/>
-        </w:rPr>
+        <w:lastRenderedPageBreak/>
         <w:drawing>
-          <wp:inline distT="0" distB="0" distL="0" distR="0" wp14:anchorId="369129E3" wp14:editId="31A840F9">
-            <wp:extent cx="1935480" cy="2042160"/>
-            <wp:effectExtent l="0" t="0" r="7620" b="0"/>
-            <wp:docPr id="786478230" name="Imagen 16"/>
+          <wp:inline distT="0" distB="0" distL="0" distR="0" wp14:anchorId="7613AFC6" wp14:editId="00FCB2F0">
+            <wp:extent cx="3781155" cy="2499360"/>
+            <wp:effectExtent l="0" t="0" r="0" b="0"/>
+            <wp:docPr id="2020395042" name="Imagen 1"/>
             <wp:cNvGraphicFramePr>
               <a:graphicFrameLocks xmlns:a="http://schemas.openxmlformats.org/drawingml/2006/main" noChangeAspect="1"/>
             </wp:cNvGraphicFramePr>
@@ -7967,36 +8295,23 @@
               <a:graphicData uri="http://schemas.openxmlformats.org/drawingml/2006/picture">
                 <pic:pic xmlns:pic="http://schemas.openxmlformats.org/drawingml/2006/picture">
                   <pic:nvPicPr>
-                    <pic:cNvPr id="0" name="Picture 43"/>
-                    <pic:cNvPicPr>
-                      <a:picLocks noChangeAspect="1" noChangeArrowheads="1"/>
-                    </pic:cNvPicPr>
+                    <pic:cNvPr id="2020395042" name=""/>
+                    <pic:cNvPicPr/>
                   </pic:nvPicPr>
                   <pic:blipFill>
-                    <a:blip r:embed="rId19">
-                      <a:extLst>
-                        <a:ext uri="{28A0092B-C50C-407E-A947-70E740481C1C}">
-                          <a14:useLocalDpi xmlns:a14="http://schemas.microsoft.com/office/drawing/2010/main" val="0"/>
-                        </a:ext>
-                      </a:extLst>
-                    </a:blip>
-                    <a:srcRect/>
+                    <a:blip r:embed="rId20"/>
                     <a:stretch>
                       <a:fillRect/>
                     </a:stretch>
                   </pic:blipFill>
-                  <pic:spPr bwMode="auto">
+                  <pic:spPr>
                     <a:xfrm>
                       <a:off x="0" y="0"/>
-                      <a:ext cx="1935480" cy="2042160"/>
+                      <a:ext cx="3801910" cy="2513079"/>
                     </a:xfrm>
                     <a:prstGeom prst="rect">
                       <a:avLst/>
                     </a:prstGeom>
-                    <a:noFill/>
-                    <a:ln>
-                      <a:noFill/>
-                    </a:ln>
                   </pic:spPr>
                 </pic:pic>
               </a:graphicData>
@@ -8039,19 +8354,17 @@
           <w:szCs w:val="20"/>
           <w:lang w:val="es-AR"/>
         </w:rPr>
-        <w:t>1</w:t>
-      </w:r>
-      <w:r>
-        <w:rPr>
-          <w:b/>
-          <w:bCs/>
+        <w:t>13</w:t>
+      </w:r>
+      <w:r>
+        <w:rPr>
           <w:i/>
           <w:iCs/>
           <w:sz w:val="20"/>
           <w:szCs w:val="20"/>
           <w:lang w:val="es-AR"/>
         </w:rPr>
-        <w:t>3</w:t>
+        <w:t xml:space="preserve">: </w:t>
       </w:r>
       <w:r>
         <w:rPr>
@@ -8061,7 +8374,7 @@
           <w:szCs w:val="20"/>
           <w:lang w:val="es-AR"/>
         </w:rPr>
-        <w:t xml:space="preserve">: </w:t>
+        <w:t>Relación entre velocidad y torque</w:t>
       </w:r>
       <w:r>
         <w:rPr>
@@ -8071,7 +8384,7 @@
           <w:szCs w:val="20"/>
           <w:lang w:val="es-AR"/>
         </w:rPr>
-        <w:t>Relación entre velocidad y torque</w:t>
+        <w:t xml:space="preserve"> para ambos estados de operación</w:t>
       </w:r>
       <w:r>
         <w:rPr>
@@ -8081,9 +8394,13 @@
           <w:szCs w:val="20"/>
           <w:lang w:val="es-AR"/>
         </w:rPr>
-        <w:t xml:space="preserve"> para ambos estados de operación</w:t>
-      </w:r>
-      <w:r>
+        <w:t xml:space="preserve"> (“falla” vs. “normal”).</w:t>
+      </w:r>
+    </w:p>
+    <w:p>
+      <w:pPr>
+        <w:spacing w:before="240" w:after="100"/>
+        <w:jc w:val="center"/>
         <w:rPr>
           <w:i/>
           <w:iCs/>
@@ -8091,8 +8408,7 @@
           <w:szCs w:val="20"/>
           <w:lang w:val="es-AR"/>
         </w:rPr>
-        <w:t xml:space="preserve"> (“falla” vs. “normal”).</w:t>
-      </w:r>
+      </w:pPr>
     </w:p>
     <w:p>
       <w:pPr>
@@ -8106,11 +8422,7 @@
           <w:lang w:val="es-AR"/>
         </w:rPr>
       </w:pPr>
-    </w:p>
-    <w:p>
-      <w:pPr>
-        <w:spacing w:before="240" w:after="100"/>
-        <w:jc w:val="center"/>
+      <w:r>
         <w:rPr>
           <w:i/>
           <w:iCs/>
@@ -8118,19 +8430,11 @@
           <w:szCs w:val="20"/>
           <w:lang w:val="es-AR"/>
         </w:rPr>
-      </w:pPr>
-      <w:r>
-        <w:rPr>
-          <w:noProof/>
-          <w:color w:val="000000"/>
-          <w:bdr w:val="none" w:sz="0" w:space="0" w:color="auto" w:frame="1"/>
-        </w:rPr>
-        <w:lastRenderedPageBreak/>
         <w:drawing>
-          <wp:inline distT="0" distB="0" distL="0" distR="0" wp14:anchorId="13847E58" wp14:editId="1F312479">
-            <wp:extent cx="2049780" cy="2148840"/>
-            <wp:effectExtent l="0" t="0" r="7620" b="3810"/>
-            <wp:docPr id="1405860921" name="Imagen 17"/>
+          <wp:inline distT="0" distB="0" distL="0" distR="0" wp14:anchorId="4B8CB4F3" wp14:editId="1F55BF53">
+            <wp:extent cx="3566160" cy="2395347"/>
+            <wp:effectExtent l="0" t="0" r="0" b="5080"/>
+            <wp:docPr id="1701006417" name="Imagen 1"/>
             <wp:cNvGraphicFramePr>
               <a:graphicFrameLocks xmlns:a="http://schemas.openxmlformats.org/drawingml/2006/main" noChangeAspect="1"/>
             </wp:cNvGraphicFramePr>
@@ -8138,36 +8442,23 @@
               <a:graphicData uri="http://schemas.openxmlformats.org/drawingml/2006/picture">
                 <pic:pic xmlns:pic="http://schemas.openxmlformats.org/drawingml/2006/picture">
                   <pic:nvPicPr>
-                    <pic:cNvPr id="0" name="Picture 51"/>
-                    <pic:cNvPicPr>
-                      <a:picLocks noChangeAspect="1" noChangeArrowheads="1"/>
-                    </pic:cNvPicPr>
+                    <pic:cNvPr id="1701006417" name=""/>
+                    <pic:cNvPicPr/>
                   </pic:nvPicPr>
                   <pic:blipFill>
-                    <a:blip r:embed="rId20">
-                      <a:extLst>
-                        <a:ext uri="{28A0092B-C50C-407E-A947-70E740481C1C}">
-                          <a14:useLocalDpi xmlns:a14="http://schemas.microsoft.com/office/drawing/2010/main" val="0"/>
-                        </a:ext>
-                      </a:extLst>
-                    </a:blip>
-                    <a:srcRect/>
+                    <a:blip r:embed="rId21"/>
                     <a:stretch>
                       <a:fillRect/>
                     </a:stretch>
                   </pic:blipFill>
-                  <pic:spPr bwMode="auto">
+                  <pic:spPr>
                     <a:xfrm>
                       <a:off x="0" y="0"/>
-                      <a:ext cx="2049780" cy="2148840"/>
+                      <a:ext cx="3582526" cy="2406340"/>
                     </a:xfrm>
                     <a:prstGeom prst="rect">
                       <a:avLst/>
                     </a:prstGeom>
-                    <a:noFill/>
-                    <a:ln>
-                      <a:noFill/>
-                    </a:ln>
                   </pic:spPr>
                 </pic:pic>
               </a:graphicData>
@@ -8210,21 +8501,183 @@
           <w:szCs w:val="20"/>
           <w:lang w:val="es-AR"/>
         </w:rPr>
-        <w:t>1</w:t>
-      </w:r>
-      <w:r>
+        <w:t>14</w:t>
+      </w:r>
+      <w:r>
+        <w:rPr>
+          <w:i/>
+          <w:iCs/>
+          <w:sz w:val="20"/>
+          <w:szCs w:val="20"/>
+          <w:lang w:val="es-AR"/>
+        </w:rPr>
+        <w:t xml:space="preserve">: </w:t>
+      </w:r>
+      <w:r>
+        <w:rPr>
+          <w:i/>
+          <w:iCs/>
+          <w:sz w:val="20"/>
+          <w:szCs w:val="20"/>
+          <w:lang w:val="es-AR"/>
+        </w:rPr>
+        <w:t>Relación entre torque y velocidad</w:t>
+      </w:r>
+      <w:r>
+        <w:rPr>
+          <w:i/>
+          <w:iCs/>
+          <w:sz w:val="20"/>
+          <w:szCs w:val="20"/>
+          <w:lang w:val="es-AR"/>
+        </w:rPr>
+        <w:t xml:space="preserve"> para ambos estados de operación</w:t>
+      </w:r>
+      <w:r>
+        <w:rPr>
+          <w:i/>
+          <w:iCs/>
+          <w:sz w:val="20"/>
+          <w:szCs w:val="20"/>
+          <w:lang w:val="es-AR"/>
+        </w:rPr>
+        <w:t xml:space="preserve"> (“falla” vs. “normal”).</w:t>
+      </w:r>
+    </w:p>
+    <w:p>
+      <w:pPr>
+        <w:spacing w:after="100"/>
+        <w:jc w:val="both"/>
         <w:rPr>
           <w:b/>
           <w:bCs/>
           <w:i/>
           <w:iCs/>
+          <w:lang w:val="es-AR"/>
+        </w:rPr>
+      </w:pPr>
+    </w:p>
+    <w:p>
+      <w:pPr>
+        <w:spacing w:after="100"/>
+        <w:jc w:val="both"/>
+        <w:rPr>
+          <w:lang w:val="es-AR"/>
+        </w:rPr>
+      </w:pPr>
+      <w:proofErr w:type="spellStart"/>
+      <w:r>
+        <w:rPr>
+          <w:b/>
+          <w:bCs/>
+          <w:i/>
+          <w:iCs/>
+          <w:lang w:val="es-AR"/>
+        </w:rPr>
+        <w:t>speed</w:t>
+      </w:r>
+      <w:proofErr w:type="spellEnd"/>
+      <w:r>
+        <w:rPr>
+          <w:b/>
+          <w:bCs/>
+          <w:lang w:val="es-AR"/>
+        </w:rPr>
+        <w:t xml:space="preserve"> vs. </w:t>
+      </w:r>
+      <w:r>
+        <w:rPr>
+          <w:b/>
+          <w:bCs/>
+          <w:i/>
+          <w:iCs/>
+          <w:lang w:val="es-AR"/>
+        </w:rPr>
+        <w:t>torque</w:t>
+      </w:r>
+      <w:r>
+        <w:rPr>
+          <w:b/>
+          <w:bCs/>
+          <w:lang w:val="es-AR"/>
+        </w:rPr>
+        <w:t xml:space="preserve"> (correlación: -0</w:t>
+      </w:r>
+      <w:r>
+        <w:rPr>
+          <w:b/>
+          <w:bCs/>
+          <w:lang w:val="es-AR"/>
+        </w:rPr>
+        <w:t>,</w:t>
+      </w:r>
+      <w:r>
+        <w:rPr>
+          <w:b/>
+          <w:bCs/>
+          <w:lang w:val="es-AR"/>
+        </w:rPr>
+        <w:t xml:space="preserve">82): </w:t>
+      </w:r>
+      <w:r>
+        <w:rPr>
+          <w:lang w:val="es-AR"/>
+        </w:rPr>
+        <w:t>f</w:t>
+      </w:r>
+      <w:r>
+        <w:rPr>
+          <w:lang w:val="es-AR"/>
+        </w:rPr>
+        <w:t xml:space="preserve">uerte correlación negativa (relación inversamente proporcional). A mayor torque exigido, menor velocidad de rotación, lo cual es consistente con la física de motores eléctricos. Las fallas (verde) se concentran en los dos extremos de esta curva operativa: cuando el torque es muy alto y la velocidad baja (sobrecarga mecánica) o cuando la velocidad es máxima y el torque cae a su mínimo (posible pérdida de carga). El rango central (operación equilibrada) corresponde principalmente a funcionamiento normal. Conclusión: </w:t>
+      </w:r>
+      <w:r>
+        <w:rPr>
+          <w:i/>
+          <w:iCs/>
+          <w:lang w:val="es-AR"/>
+        </w:rPr>
+        <w:t>torque</w:t>
+      </w:r>
+      <w:r>
+        <w:rPr>
+          <w:lang w:val="es-AR"/>
+        </w:rPr>
+        <w:t xml:space="preserve"> &gt; 65 Nm o </w:t>
+      </w:r>
+      <w:proofErr w:type="spellStart"/>
+      <w:r>
+        <w:rPr>
+          <w:i/>
+          <w:iCs/>
+          <w:lang w:val="es-AR"/>
+        </w:rPr>
+        <w:t>speed</w:t>
+      </w:r>
+      <w:proofErr w:type="spellEnd"/>
+      <w:r>
+        <w:rPr>
+          <w:lang w:val="es-AR"/>
+        </w:rPr>
+        <w:t xml:space="preserve"> &gt; 2500 RPM son zonas de riesgo crítico.</w:t>
+      </w:r>
+    </w:p>
+    <w:p>
+      <w:pPr>
+        <w:spacing w:before="240" w:after="100"/>
+        <w:rPr>
+          <w:i/>
+          <w:iCs/>
           <w:sz w:val="20"/>
           <w:szCs w:val="20"/>
           <w:lang w:val="es-AR"/>
         </w:rPr>
-        <w:t>4</w:t>
-      </w:r>
-      <w:r>
+      </w:pPr>
+    </w:p>
+    <w:p>
+      <w:pPr>
+        <w:spacing w:before="240" w:after="100"/>
+        <w:jc w:val="center"/>
         <w:rPr>
           <w:i/>
           <w:iCs/>
@@ -8232,8 +8685,7 @@
           <w:szCs w:val="20"/>
           <w:lang w:val="es-AR"/>
         </w:rPr>
-        <w:t xml:space="preserve">: </w:t>
-      </w:r>
+      </w:pPr>
       <w:r>
         <w:rPr>
           <w:i/>
@@ -8242,97 +8694,12 @@
           <w:szCs w:val="20"/>
           <w:lang w:val="es-AR"/>
         </w:rPr>
-        <w:t xml:space="preserve">Relación entre </w:t>
-      </w:r>
-      <w:r>
-        <w:rPr>
-          <w:i/>
-          <w:iCs/>
-          <w:sz w:val="20"/>
-          <w:szCs w:val="20"/>
-          <w:lang w:val="es-AR"/>
-        </w:rPr>
-        <w:t>torque</w:t>
-      </w:r>
-      <w:r>
-        <w:rPr>
-          <w:i/>
-          <w:iCs/>
-          <w:sz w:val="20"/>
-          <w:szCs w:val="20"/>
-          <w:lang w:val="es-AR"/>
-        </w:rPr>
-        <w:t xml:space="preserve"> y </w:t>
-      </w:r>
-      <w:r>
-        <w:rPr>
-          <w:i/>
-          <w:iCs/>
-          <w:sz w:val="20"/>
-          <w:szCs w:val="20"/>
-          <w:lang w:val="es-AR"/>
-        </w:rPr>
-        <w:t>velocidad</w:t>
-      </w:r>
-      <w:r>
-        <w:rPr>
-          <w:i/>
-          <w:iCs/>
-          <w:sz w:val="20"/>
-          <w:szCs w:val="20"/>
-          <w:lang w:val="es-AR"/>
-        </w:rPr>
-        <w:t xml:space="preserve"> para ambos estados de operación</w:t>
-      </w:r>
-      <w:r>
-        <w:rPr>
-          <w:i/>
-          <w:iCs/>
-          <w:sz w:val="20"/>
-          <w:szCs w:val="20"/>
-          <w:lang w:val="es-AR"/>
-        </w:rPr>
-        <w:t xml:space="preserve"> (“falla” vs. “normal”).</w:t>
-      </w:r>
-    </w:p>
-    <w:p>
-      <w:pPr>
-        <w:spacing w:before="240" w:after="100"/>
-        <w:jc w:val="center"/>
-        <w:rPr>
-          <w:i/>
-          <w:iCs/>
-          <w:sz w:val="20"/>
-          <w:szCs w:val="20"/>
-          <w:lang w:val="es-AR"/>
-        </w:rPr>
-      </w:pPr>
-    </w:p>
-    <w:p>
-      <w:pPr>
-        <w:spacing w:before="240" w:after="100"/>
-        <w:jc w:val="center"/>
-        <w:rPr>
-          <w:i/>
-          <w:iCs/>
-          <w:sz w:val="20"/>
-          <w:szCs w:val="20"/>
-          <w:lang w:val="es-AR"/>
-        </w:rPr>
-      </w:pPr>
-      <w:r>
-        <w:rPr>
-          <w:b/>
-          <w:bCs/>
-          <w:noProof/>
-          <w:color w:val="000000"/>
-          <w:bdr w:val="none" w:sz="0" w:space="0" w:color="auto" w:frame="1"/>
-        </w:rPr>
+        <w:lastRenderedPageBreak/>
         <w:drawing>
-          <wp:inline distT="0" distB="0" distL="0" distR="0" wp14:anchorId="76D56582" wp14:editId="1ACB3936">
-            <wp:extent cx="1965960" cy="2077662"/>
-            <wp:effectExtent l="0" t="0" r="0" b="0"/>
-            <wp:docPr id="1639918706" name="Imagen 18"/>
+          <wp:inline distT="0" distB="0" distL="0" distR="0" wp14:anchorId="431D70AF" wp14:editId="6DF338E1">
+            <wp:extent cx="4472940" cy="2936563"/>
+            <wp:effectExtent l="0" t="0" r="3810" b="0"/>
+            <wp:docPr id="1912079185" name="Imagen 1"/>
             <wp:cNvGraphicFramePr>
               <a:graphicFrameLocks xmlns:a="http://schemas.openxmlformats.org/drawingml/2006/main" noChangeAspect="1"/>
             </wp:cNvGraphicFramePr>
@@ -8340,36 +8707,23 @@
               <a:graphicData uri="http://schemas.openxmlformats.org/drawingml/2006/picture">
                 <pic:pic xmlns:pic="http://schemas.openxmlformats.org/drawingml/2006/picture">
                   <pic:nvPicPr>
-                    <pic:cNvPr id="0" name="Picture 53"/>
-                    <pic:cNvPicPr>
-                      <a:picLocks noChangeAspect="1" noChangeArrowheads="1"/>
-                    </pic:cNvPicPr>
+                    <pic:cNvPr id="1912079185" name=""/>
+                    <pic:cNvPicPr/>
                   </pic:nvPicPr>
                   <pic:blipFill>
-                    <a:blip r:embed="rId21">
-                      <a:extLst>
-                        <a:ext uri="{28A0092B-C50C-407E-A947-70E740481C1C}">
-                          <a14:useLocalDpi xmlns:a14="http://schemas.microsoft.com/office/drawing/2010/main" val="0"/>
-                        </a:ext>
-                      </a:extLst>
-                    </a:blip>
-                    <a:srcRect/>
+                    <a:blip r:embed="rId22"/>
                     <a:stretch>
                       <a:fillRect/>
                     </a:stretch>
                   </pic:blipFill>
-                  <pic:spPr bwMode="auto">
+                  <pic:spPr>
                     <a:xfrm>
                       <a:off x="0" y="0"/>
-                      <a:ext cx="1973089" cy="2085196"/>
+                      <a:ext cx="4489581" cy="2947488"/>
                     </a:xfrm>
                     <a:prstGeom prst="rect">
                       <a:avLst/>
                     </a:prstGeom>
-                    <a:noFill/>
-                    <a:ln>
-                      <a:noFill/>
-                    </a:ln>
                   </pic:spPr>
                 </pic:pic>
               </a:graphicData>
@@ -8412,21 +8766,163 @@
           <w:szCs w:val="20"/>
           <w:lang w:val="es-AR"/>
         </w:rPr>
-        <w:t>1</w:t>
-      </w:r>
-      <w:r>
+        <w:t>15</w:t>
+      </w:r>
+      <w:r>
+        <w:rPr>
+          <w:i/>
+          <w:iCs/>
+          <w:sz w:val="20"/>
+          <w:szCs w:val="20"/>
+          <w:lang w:val="es-AR"/>
+        </w:rPr>
+        <w:t xml:space="preserve">: </w:t>
+      </w:r>
+      <w:r>
+        <w:rPr>
+          <w:i/>
+          <w:iCs/>
+          <w:sz w:val="20"/>
+          <w:szCs w:val="20"/>
+          <w:lang w:val="es-AR"/>
+        </w:rPr>
+        <w:t>Distribución del torque</w:t>
+      </w:r>
+      <w:r>
+        <w:rPr>
+          <w:i/>
+          <w:iCs/>
+          <w:sz w:val="20"/>
+          <w:szCs w:val="20"/>
+          <w:lang w:val="es-AR"/>
+        </w:rPr>
+        <w:t xml:space="preserve"> para ambos estados de operación</w:t>
+      </w:r>
+      <w:r>
+        <w:rPr>
+          <w:i/>
+          <w:iCs/>
+          <w:sz w:val="20"/>
+          <w:szCs w:val="20"/>
+          <w:lang w:val="es-AR"/>
+        </w:rPr>
+        <w:t xml:space="preserve"> (“falla” vs. “normal”).</w:t>
+      </w:r>
+    </w:p>
+    <w:p>
+      <w:pPr>
+        <w:spacing w:after="100"/>
+        <w:jc w:val="both"/>
         <w:rPr>
           <w:b/>
           <w:bCs/>
           <w:i/>
           <w:iCs/>
+          <w:lang w:val="es-AR"/>
+        </w:rPr>
+      </w:pPr>
+    </w:p>
+    <w:p>
+      <w:pPr>
+        <w:spacing w:after="100"/>
+        <w:jc w:val="both"/>
+        <w:rPr>
+          <w:lang w:val="es-AR"/>
+        </w:rPr>
+      </w:pPr>
+      <w:r>
+        <w:rPr>
+          <w:b/>
+          <w:bCs/>
+          <w:i/>
+          <w:iCs/>
+          <w:lang w:val="es-AR"/>
+        </w:rPr>
+        <w:t>torque</w:t>
+      </w:r>
+      <w:r>
+        <w:rPr>
+          <w:b/>
+          <w:bCs/>
+          <w:lang w:val="es-AR"/>
+        </w:rPr>
+        <w:t xml:space="preserve"> (distribución por </w:t>
+      </w:r>
+      <w:proofErr w:type="gramStart"/>
+      <w:r>
+        <w:rPr>
+          <w:b/>
+          <w:bCs/>
+          <w:i/>
+          <w:iCs/>
+          <w:lang w:val="es-AR"/>
+        </w:rPr>
+        <w:t>target</w:t>
+      </w:r>
+      <w:proofErr w:type="gramEnd"/>
+      <w:r>
+        <w:rPr>
+          <w:b/>
+          <w:bCs/>
+          <w:lang w:val="es-AR"/>
+        </w:rPr>
+        <w:t xml:space="preserve">): </w:t>
+      </w:r>
+      <w:r>
+        <w:rPr>
+          <w:lang w:val="es-AR"/>
+        </w:rPr>
+        <w:t>e</w:t>
+      </w:r>
+      <w:r>
+        <w:rPr>
+          <w:lang w:val="es-AR"/>
+        </w:rPr>
+        <w:t>l torque es el mejor diferenciador individual de fallas. Las distribuciones de operación normal y falla están claramente desplazadas: los casos normales se concentran en el rango 30</w:t>
+      </w:r>
+      <w:r>
+        <w:rPr>
+          <w:lang w:val="es-AR"/>
+        </w:rPr>
+        <w:t>-</w:t>
+      </w:r>
+      <w:r>
+        <w:rPr>
+          <w:lang w:val="es-AR"/>
+        </w:rPr>
+        <w:t xml:space="preserve">55 Nm, mientras que las fallas se asocian principalmente a torques elevados (&gt;60 Nm) y también a torques muy bajos (&lt;15 Nm). Esta </w:t>
+      </w:r>
+      <w:proofErr w:type="spellStart"/>
+      <w:r>
+        <w:rPr>
+          <w:lang w:val="es-AR"/>
+        </w:rPr>
+        <w:t>bimodalidad</w:t>
+      </w:r>
+      <w:proofErr w:type="spellEnd"/>
+      <w:r>
+        <w:rPr>
+          <w:lang w:val="es-AR"/>
+        </w:rPr>
+        <w:t xml:space="preserve"> en fallas sugiere dos mecanismos distintos de avería.</w:t>
+      </w:r>
+    </w:p>
+    <w:p>
+      <w:pPr>
+        <w:spacing w:after="100"/>
+        <w:rPr>
+          <w:i/>
+          <w:iCs/>
           <w:sz w:val="20"/>
           <w:szCs w:val="20"/>
           <w:lang w:val="es-AR"/>
         </w:rPr>
-        <w:t>5</w:t>
-      </w:r>
-      <w:r>
+      </w:pPr>
+    </w:p>
+    <w:p>
+      <w:pPr>
+        <w:spacing w:after="100"/>
+        <w:jc w:val="center"/>
         <w:rPr>
           <w:i/>
           <w:iCs/>
@@ -8434,8 +8930,7 @@
           <w:szCs w:val="20"/>
           <w:lang w:val="es-AR"/>
         </w:rPr>
-        <w:t xml:space="preserve">: </w:t>
-      </w:r>
+      </w:pPr>
       <w:r>
         <w:rPr>
           <w:i/>
@@ -8444,9 +8939,47 @@
           <w:szCs w:val="20"/>
           <w:lang w:val="es-AR"/>
         </w:rPr>
-        <w:t>Distribución del torque</w:t>
-      </w:r>
-      <w:r>
+        <w:drawing>
+          <wp:inline distT="0" distB="0" distL="0" distR="0" wp14:anchorId="40C9E052" wp14:editId="42B27CC6">
+            <wp:extent cx="4130040" cy="2778952"/>
+            <wp:effectExtent l="0" t="0" r="3810" b="2540"/>
+            <wp:docPr id="796918603" name="Imagen 1"/>
+            <wp:cNvGraphicFramePr>
+              <a:graphicFrameLocks xmlns:a="http://schemas.openxmlformats.org/drawingml/2006/main" noChangeAspect="1"/>
+            </wp:cNvGraphicFramePr>
+            <a:graphic xmlns:a="http://schemas.openxmlformats.org/drawingml/2006/main">
+              <a:graphicData uri="http://schemas.openxmlformats.org/drawingml/2006/picture">
+                <pic:pic xmlns:pic="http://schemas.openxmlformats.org/drawingml/2006/picture">
+                  <pic:nvPicPr>
+                    <pic:cNvPr id="796918603" name=""/>
+                    <pic:cNvPicPr/>
+                  </pic:nvPicPr>
+                  <pic:blipFill>
+                    <a:blip r:embed="rId23"/>
+                    <a:stretch>
+                      <a:fillRect/>
+                    </a:stretch>
+                  </pic:blipFill>
+                  <pic:spPr>
+                    <a:xfrm>
+                      <a:off x="0" y="0"/>
+                      <a:ext cx="4135035" cy="2782313"/>
+                    </a:xfrm>
+                    <a:prstGeom prst="rect">
+                      <a:avLst/>
+                    </a:prstGeom>
+                  </pic:spPr>
+                </pic:pic>
+              </a:graphicData>
+            </a:graphic>
+          </wp:inline>
+        </w:drawing>
+      </w:r>
+    </w:p>
+    <w:p>
+      <w:pPr>
+        <w:spacing w:before="240" w:after="100"/>
+        <w:jc w:val="center"/>
         <w:rPr>
           <w:i/>
           <w:iCs/>
@@ -8454,30 +8987,91 @@
           <w:szCs w:val="20"/>
           <w:lang w:val="es-AR"/>
         </w:rPr>
-        <w:t xml:space="preserve"> para ambos estados de operación</w:t>
-      </w:r>
-      <w:r>
-        <w:rPr>
+      </w:pPr>
+      <w:r>
+        <w:rPr>
+          <w:b/>
+          <w:bCs/>
           <w:i/>
           <w:iCs/>
           <w:sz w:val="20"/>
           <w:szCs w:val="20"/>
           <w:lang w:val="es-AR"/>
         </w:rPr>
-        <w:t xml:space="preserve"> (“falla” vs. “normal”).</w:t>
-      </w:r>
-    </w:p>
-    <w:p>
-      <w:pPr>
-        <w:spacing w:after="100"/>
-        <w:rPr>
+        <w:t xml:space="preserve">Figura </w:t>
+      </w:r>
+      <w:r>
+        <w:rPr>
+          <w:b/>
+          <w:bCs/>
           <w:i/>
           <w:iCs/>
           <w:sz w:val="20"/>
           <w:szCs w:val="20"/>
           <w:lang w:val="es-AR"/>
         </w:rPr>
-      </w:pPr>
+        <w:t>15</w:t>
+      </w:r>
+      <w:r>
+        <w:rPr>
+          <w:i/>
+          <w:iCs/>
+          <w:sz w:val="20"/>
+          <w:szCs w:val="20"/>
+          <w:lang w:val="es-AR"/>
+        </w:rPr>
+        <w:t xml:space="preserve">: </w:t>
+      </w:r>
+      <w:r>
+        <w:rPr>
+          <w:i/>
+          <w:iCs/>
+          <w:sz w:val="20"/>
+          <w:szCs w:val="20"/>
+          <w:lang w:val="es-AR"/>
+        </w:rPr>
+        <w:t>Relación entre temperatura del aire y temperatura del proceso</w:t>
+      </w:r>
+      <w:r>
+        <w:rPr>
+          <w:i/>
+          <w:iCs/>
+          <w:sz w:val="20"/>
+          <w:szCs w:val="20"/>
+          <w:lang w:val="es-AR"/>
+        </w:rPr>
+        <w:t xml:space="preserve"> </w:t>
+      </w:r>
+      <w:r>
+        <w:rPr>
+          <w:i/>
+          <w:iCs/>
+          <w:sz w:val="20"/>
+          <w:szCs w:val="20"/>
+          <w:lang w:val="es-AR"/>
+        </w:rPr>
+        <w:t xml:space="preserve">para </w:t>
+      </w:r>
+      <w:r>
+        <w:rPr>
+          <w:i/>
+          <w:iCs/>
+          <w:sz w:val="20"/>
+          <w:szCs w:val="20"/>
+          <w:lang w:val="es-AR"/>
+        </w:rPr>
+        <w:t>ambos estados de operación</w:t>
+      </w:r>
+      <w:r>
+        <w:rPr>
+          <w:i/>
+          <w:iCs/>
+          <w:sz w:val="20"/>
+          <w:szCs w:val="20"/>
+          <w:lang w:val="es-AR"/>
+        </w:rPr>
+        <w:t xml:space="preserve"> (“falla” vs. “normal”).</w:t>
+      </w:r>
     </w:p>
     <w:p>
       <w:pPr>
@@ -8504,6 +9098,7 @@
           <w:iCs/>
           <w:lang w:val="es-AR"/>
         </w:rPr>
+        <w:lastRenderedPageBreak/>
         <w:t>air_temp</w:t>
       </w:r>
       <w:proofErr w:type="spellEnd"/>
@@ -8574,275 +9169,154 @@
     </w:p>
     <w:p>
       <w:pPr>
-        <w:spacing w:after="100"/>
-        <w:jc w:val="both"/>
-        <w:rPr>
-          <w:lang w:val="es-AR"/>
-        </w:rPr>
-      </w:pPr>
-      <w:proofErr w:type="spellStart"/>
+        <w:spacing w:after="60"/>
+        <w:jc w:val="center"/>
+        <w:rPr>
+          <w:lang w:val="es-AR"/>
+        </w:rPr>
+      </w:pPr>
+      <w:r>
+        <w:rPr>
+          <w:lang w:val="es-AR"/>
+        </w:rPr>
+        <w:drawing>
+          <wp:inline distT="0" distB="0" distL="0" distR="0" wp14:anchorId="16D9F138" wp14:editId="0E938D1D">
+            <wp:extent cx="4373880" cy="2882742"/>
+            <wp:effectExtent l="0" t="0" r="7620" b="0"/>
+            <wp:docPr id="725626491" name="Imagen 1"/>
+            <wp:cNvGraphicFramePr>
+              <a:graphicFrameLocks xmlns:a="http://schemas.openxmlformats.org/drawingml/2006/main" noChangeAspect="1"/>
+            </wp:cNvGraphicFramePr>
+            <a:graphic xmlns:a="http://schemas.openxmlformats.org/drawingml/2006/main">
+              <a:graphicData uri="http://schemas.openxmlformats.org/drawingml/2006/picture">
+                <pic:pic xmlns:pic="http://schemas.openxmlformats.org/drawingml/2006/picture">
+                  <pic:nvPicPr>
+                    <pic:cNvPr id="725626491" name=""/>
+                    <pic:cNvPicPr/>
+                  </pic:nvPicPr>
+                  <pic:blipFill>
+                    <a:blip r:embed="rId24"/>
+                    <a:stretch>
+                      <a:fillRect/>
+                    </a:stretch>
+                  </pic:blipFill>
+                  <pic:spPr>
+                    <a:xfrm>
+                      <a:off x="0" y="0"/>
+                      <a:ext cx="4377613" cy="2885202"/>
+                    </a:xfrm>
+                    <a:prstGeom prst="rect">
+                      <a:avLst/>
+                    </a:prstGeom>
+                  </pic:spPr>
+                </pic:pic>
+              </a:graphicData>
+            </a:graphic>
+          </wp:inline>
+        </w:drawing>
+      </w:r>
+    </w:p>
+    <w:p>
+      <w:pPr>
+        <w:spacing w:before="240" w:after="100"/>
+        <w:jc w:val="center"/>
+        <w:rPr>
+          <w:i/>
+          <w:iCs/>
+          <w:sz w:val="20"/>
+          <w:szCs w:val="20"/>
+          <w:lang w:val="es-AR"/>
+        </w:rPr>
+      </w:pPr>
       <w:r>
         <w:rPr>
           <w:b/>
           <w:bCs/>
           <w:i/>
           <w:iCs/>
-          <w:lang w:val="es-AR"/>
-        </w:rPr>
-        <w:t>speed</w:t>
-      </w:r>
-      <w:proofErr w:type="spellEnd"/>
+          <w:sz w:val="20"/>
+          <w:szCs w:val="20"/>
+          <w:lang w:val="es-AR"/>
+        </w:rPr>
+        <w:t xml:space="preserve">Figura </w:t>
+      </w:r>
       <w:r>
         <w:rPr>
           <w:b/>
           <w:bCs/>
-          <w:lang w:val="es-AR"/>
-        </w:rPr>
-        <w:t xml:space="preserve"> vs. </w:t>
-      </w:r>
-      <w:r>
-        <w:rPr>
-          <w:b/>
-          <w:bCs/>
-          <w:i/>
-          <w:iCs/>
-          <w:lang w:val="es-AR"/>
-        </w:rPr>
-        <w:t>torque</w:t>
-      </w:r>
-      <w:r>
-        <w:rPr>
-          <w:b/>
-          <w:bCs/>
-          <w:lang w:val="es-AR"/>
-        </w:rPr>
-        <w:t xml:space="preserve"> (correlación: -0</w:t>
-      </w:r>
-      <w:r>
-        <w:rPr>
-          <w:b/>
-          <w:bCs/>
-          <w:lang w:val="es-AR"/>
-        </w:rPr>
-        <w:t>,</w:t>
-      </w:r>
-      <w:r>
-        <w:rPr>
-          <w:b/>
-          <w:bCs/>
-          <w:lang w:val="es-AR"/>
-        </w:rPr>
-        <w:t xml:space="preserve">82): </w:t>
-      </w:r>
-      <w:r>
-        <w:rPr>
-          <w:lang w:val="es-AR"/>
-        </w:rPr>
-        <w:t>f</w:t>
-      </w:r>
-      <w:r>
-        <w:rPr>
-          <w:lang w:val="es-AR"/>
-        </w:rPr>
-        <w:t xml:space="preserve">uerte correlación negativa (relación inversamente proporcional). A mayor torque exigido, menor velocidad de rotación, lo cual es consistente con la física de motores eléctricos. Las fallas (verde) se concentran en los dos extremos de esta curva operativa: cuando el torque es muy alto y la velocidad baja (sobrecarga mecánica) o cuando la velocidad es máxima y el torque cae a su mínimo (posible pérdida de carga). El rango central (operación equilibrada) corresponde principalmente a funcionamiento normal. Conclusión: </w:t>
-      </w:r>
-      <w:r>
-        <w:rPr>
-          <w:i/>
-          <w:iCs/>
-          <w:lang w:val="es-AR"/>
-        </w:rPr>
-        <w:t>torque</w:t>
-      </w:r>
-      <w:r>
-        <w:rPr>
-          <w:lang w:val="es-AR"/>
-        </w:rPr>
-        <w:t xml:space="preserve"> &gt; 65 Nm o </w:t>
-      </w:r>
-      <w:proofErr w:type="spellStart"/>
-      <w:r>
-        <w:rPr>
-          <w:i/>
-          <w:iCs/>
-          <w:lang w:val="es-AR"/>
-        </w:rPr>
-        <w:t>speed</w:t>
-      </w:r>
-      <w:proofErr w:type="spellEnd"/>
-      <w:r>
-        <w:rPr>
-          <w:lang w:val="es-AR"/>
-        </w:rPr>
-        <w:t xml:space="preserve"> &gt; 2500 RPM son zonas de riesgo crítico.</w:t>
+          <w:i/>
+          <w:iCs/>
+          <w:sz w:val="20"/>
+          <w:szCs w:val="20"/>
+          <w:lang w:val="es-AR"/>
+        </w:rPr>
+        <w:t>12</w:t>
+      </w:r>
+      <w:r>
+        <w:rPr>
+          <w:i/>
+          <w:iCs/>
+          <w:sz w:val="20"/>
+          <w:szCs w:val="20"/>
+          <w:lang w:val="es-AR"/>
+        </w:rPr>
+        <w:t xml:space="preserve">: </w:t>
+      </w:r>
+      <w:r>
+        <w:rPr>
+          <w:i/>
+          <w:iCs/>
+          <w:sz w:val="20"/>
+          <w:szCs w:val="20"/>
+          <w:lang w:val="es-AR"/>
+        </w:rPr>
+        <w:t>D</w:t>
+      </w:r>
+      <w:r>
+        <w:rPr>
+          <w:i/>
+          <w:iCs/>
+          <w:sz w:val="20"/>
+          <w:szCs w:val="20"/>
+          <w:lang w:val="es-AR"/>
+        </w:rPr>
+        <w:t>istribución de</w:t>
+      </w:r>
+      <w:r>
+        <w:rPr>
+          <w:i/>
+          <w:iCs/>
+          <w:sz w:val="20"/>
+          <w:szCs w:val="20"/>
+          <w:lang w:val="es-AR"/>
+        </w:rPr>
+        <w:t xml:space="preserve">l desgaste de la herramienta </w:t>
+      </w:r>
+      <w:r>
+        <w:rPr>
+          <w:i/>
+          <w:iCs/>
+          <w:sz w:val="20"/>
+          <w:szCs w:val="20"/>
+          <w:lang w:val="es-AR"/>
+        </w:rPr>
+        <w:t>para ambos estados de operación</w:t>
+      </w:r>
+      <w:r>
+        <w:rPr>
+          <w:i/>
+          <w:iCs/>
+          <w:sz w:val="20"/>
+          <w:szCs w:val="20"/>
+          <w:lang w:val="es-AR"/>
+        </w:rPr>
+        <w:t xml:space="preserve"> (“falla” vs. “normal”).</w:t>
       </w:r>
     </w:p>
     <w:p>
       <w:pPr>
         <w:spacing w:after="60"/>
-        <w:rPr>
-          <w:lang w:val="es-AR"/>
-        </w:rPr>
-      </w:pPr>
-    </w:p>
-    <w:p>
-      <w:pPr>
-        <w:spacing w:after="100"/>
-        <w:jc w:val="both"/>
-        <w:rPr>
-          <w:lang w:val="es-AR"/>
-        </w:rPr>
-      </w:pPr>
-      <w:r>
-        <w:rPr>
-          <w:b/>
-          <w:bCs/>
-          <w:i/>
-          <w:iCs/>
-          <w:lang w:val="es-AR"/>
-        </w:rPr>
-        <w:lastRenderedPageBreak/>
-        <w:t>torque</w:t>
-      </w:r>
-      <w:r>
-        <w:rPr>
-          <w:b/>
-          <w:bCs/>
-          <w:lang w:val="es-AR"/>
-        </w:rPr>
-        <w:t xml:space="preserve"> (distribución por </w:t>
-      </w:r>
-      <w:proofErr w:type="gramStart"/>
-      <w:r>
-        <w:rPr>
-          <w:b/>
-          <w:bCs/>
-          <w:i/>
-          <w:iCs/>
-          <w:lang w:val="es-AR"/>
-        </w:rPr>
-        <w:t>target</w:t>
-      </w:r>
-      <w:proofErr w:type="gramEnd"/>
-      <w:r>
-        <w:rPr>
-          <w:b/>
-          <w:bCs/>
-          <w:lang w:val="es-AR"/>
-        </w:rPr>
-        <w:t xml:space="preserve">): </w:t>
-      </w:r>
-      <w:r>
-        <w:rPr>
-          <w:lang w:val="es-AR"/>
-        </w:rPr>
-        <w:t>e</w:t>
-      </w:r>
-      <w:r>
-        <w:rPr>
-          <w:lang w:val="es-AR"/>
-        </w:rPr>
-        <w:t>l torque es el mejor diferenciador individual de fallas. Las distribuciones de operación normal y falla están claramente desplazadas: los casos normales se concentran en el rango 30</w:t>
-      </w:r>
-      <w:r>
-        <w:rPr>
-          <w:lang w:val="es-AR"/>
-        </w:rPr>
-        <w:t>-</w:t>
-      </w:r>
-      <w:r>
-        <w:rPr>
-          <w:lang w:val="es-AR"/>
-        </w:rPr>
-        <w:t xml:space="preserve">55 Nm, mientras que las fallas se asocian principalmente a torques elevados (&gt;60 Nm) y también a torques muy bajos (&lt;15 Nm). Esta </w:t>
-      </w:r>
-      <w:proofErr w:type="spellStart"/>
-      <w:r>
-        <w:rPr>
-          <w:lang w:val="es-AR"/>
-        </w:rPr>
-        <w:t>bimodalidad</w:t>
-      </w:r>
-      <w:proofErr w:type="spellEnd"/>
-      <w:r>
-        <w:rPr>
-          <w:lang w:val="es-AR"/>
-        </w:rPr>
-        <w:t xml:space="preserve"> en fallas sugiere dos mecanismos distintos de avería.</w:t>
-      </w:r>
-    </w:p>
-    <w:p>
-      <w:pPr>
-        <w:spacing w:after="60"/>
-        <w:rPr>
-          <w:lang w:val="es-AR"/>
-        </w:rPr>
-      </w:pPr>
-    </w:p>
-    <w:p>
-      <w:pPr>
-        <w:spacing w:after="100"/>
-        <w:jc w:val="both"/>
-        <w:rPr>
-          <w:lang w:val="es-AR"/>
-        </w:rPr>
-      </w:pPr>
-      <w:proofErr w:type="spellStart"/>
-      <w:r>
-        <w:rPr>
-          <w:b/>
-          <w:bCs/>
-          <w:i/>
-          <w:iCs/>
-          <w:lang w:val="es-AR"/>
-        </w:rPr>
-        <w:t>speed</w:t>
-      </w:r>
-      <w:proofErr w:type="spellEnd"/>
-      <w:r>
-        <w:rPr>
-          <w:b/>
-          <w:bCs/>
-          <w:lang w:val="es-AR"/>
-        </w:rPr>
-        <w:t xml:space="preserve"> (distribución por </w:t>
-      </w:r>
-      <w:proofErr w:type="gramStart"/>
-      <w:r>
-        <w:rPr>
-          <w:b/>
-          <w:bCs/>
-          <w:i/>
-          <w:iCs/>
-          <w:lang w:val="es-AR"/>
-        </w:rPr>
-        <w:t>target</w:t>
-      </w:r>
-      <w:proofErr w:type="gramEnd"/>
-      <w:r>
-        <w:rPr>
-          <w:b/>
-          <w:bCs/>
-          <w:lang w:val="es-AR"/>
-        </w:rPr>
-        <w:t xml:space="preserve">): </w:t>
-      </w:r>
-      <w:r>
-        <w:rPr>
-          <w:lang w:val="es-AR"/>
-        </w:rPr>
-        <w:t>l</w:t>
-      </w:r>
-      <w:r>
-        <w:rPr>
-          <w:lang w:val="es-AR"/>
-        </w:rPr>
-        <w:t>a velocidad también diferencia bien las clases. La operación normal se mantiene estable entre 1200 y 1800 RPM (rango seguro), mientras que las fallas se concentran cerca de 1350 RPM (velocidad ligeramente baja) y en torno a 2700 RPM (velocidad muy alta). Esto indica que el sistema opera con seguridad dentro de un rango intermedio de velocidades.</w:t>
-      </w:r>
-    </w:p>
-    <w:p>
-      <w:pPr>
-        <w:spacing w:after="60"/>
+        <w:jc w:val="center"/>
         <w:rPr>
           <w:lang w:val="es-AR"/>
         </w:rPr>
@@ -8996,12 +9470,6 @@
         <w:gridCol w:w="4847"/>
       </w:tblGrid>
       <w:tr>
-        <w:tblPrEx>
-          <w:tblCellMar>
-            <w:top w:w="0" w:type="dxa"/>
-            <w:bottom w:w="0" w:type="dxa"/>
-          </w:tblCellMar>
-        </w:tblPrEx>
         <w:trPr>
           <w:tblHeader/>
         </w:trPr>
@@ -9110,12 +9578,6 @@
         </w:tc>
       </w:tr>
       <w:tr>
-        <w:tblPrEx>
-          <w:tblCellMar>
-            <w:top w:w="0" w:type="dxa"/>
-            <w:bottom w:w="0" w:type="dxa"/>
-          </w:tblCellMar>
-        </w:tblPrEx>
         <w:tc>
           <w:tcPr>
             <w:tcW w:w="2800" w:type="dxa"/>
@@ -9253,12 +9715,6 @@
         </w:tc>
       </w:tr>
       <w:tr>
-        <w:tblPrEx>
-          <w:tblCellMar>
-            <w:top w:w="0" w:type="dxa"/>
-            <w:bottom w:w="0" w:type="dxa"/>
-          </w:tblCellMar>
-        </w:tblPrEx>
         <w:tc>
           <w:tcPr>
             <w:tcW w:w="2800" w:type="dxa"/>
@@ -9374,12 +9830,6 @@
         </w:tc>
       </w:tr>
       <w:tr>
-        <w:tblPrEx>
-          <w:tblCellMar>
-            <w:top w:w="0" w:type="dxa"/>
-            <w:bottom w:w="0" w:type="dxa"/>
-          </w:tblCellMar>
-        </w:tblPrEx>
         <w:tc>
           <w:tcPr>
             <w:tcW w:w="2800" w:type="dxa"/>
@@ -9525,12 +9975,6 @@
         </w:tc>
       </w:tr>
       <w:tr>
-        <w:tblPrEx>
-          <w:tblCellMar>
-            <w:top w:w="0" w:type="dxa"/>
-            <w:bottom w:w="0" w:type="dxa"/>
-          </w:tblCellMar>
-        </w:tblPrEx>
         <w:tc>
           <w:tcPr>
             <w:tcW w:w="2800" w:type="dxa"/>
@@ -9692,12 +10136,6 @@
         </w:tc>
       </w:tr>
       <w:tr>
-        <w:tblPrEx>
-          <w:tblCellMar>
-            <w:top w:w="0" w:type="dxa"/>
-            <w:bottom w:w="0" w:type="dxa"/>
-          </w:tblCellMar>
-        </w:tblPrEx>
         <w:tc>
           <w:tcPr>
             <w:tcW w:w="2800" w:type="dxa"/>
@@ -9731,6 +10169,7 @@
                 <w:sz w:val="20"/>
                 <w:szCs w:val="20"/>
               </w:rPr>
+              <w:lastRenderedPageBreak/>
               <w:t>air_temp</w:t>
             </w:r>
             <w:proofErr w:type="spellEnd"/>
@@ -9861,12 +10300,6 @@
         </w:tc>
       </w:tr>
       <w:tr>
-        <w:tblPrEx>
-          <w:tblCellMar>
-            <w:top w:w="0" w:type="dxa"/>
-            <w:bottom w:w="0" w:type="dxa"/>
-          </w:tblCellMar>
-        </w:tblPrEx>
         <w:tc>
           <w:tcPr>
             <w:tcW w:w="2800" w:type="dxa"/>
@@ -10071,6 +10504,80 @@
     </w:p>
     <w:p>
       <w:pPr>
+        <w:rPr>
+          <w:lang w:val="es-AR"/>
+        </w:rPr>
+      </w:pPr>
+      <w:r>
+        <w:rPr>
+          <w:lang w:val="es-AR"/>
+        </w:rPr>
+        <w:br w:type="page"/>
+      </w:r>
+    </w:p>
+    <w:p>
+      <w:pPr>
+        <w:pStyle w:val="Ttulo1"/>
+        <w:rPr>
+          <w:color w:val="auto"/>
+          <w:lang w:val="es-AR"/>
+        </w:rPr>
+      </w:pPr>
+      <w:r>
+        <w:rPr>
+          <w:color w:val="auto"/>
+          <w:lang w:val="es-AR"/>
+        </w:rPr>
+        <w:lastRenderedPageBreak/>
+        <w:t>4. Parte 2</w:t>
+      </w:r>
+      <w:r>
+        <w:rPr>
+          <w:color w:val="auto"/>
+          <w:lang w:val="es-AR"/>
+        </w:rPr>
+        <w:t xml:space="preserve"> - </w:t>
+      </w:r>
+      <w:r>
+        <w:rPr>
+          <w:color w:val="auto"/>
+          <w:lang w:val="es-AR"/>
+        </w:rPr>
+        <w:t xml:space="preserve">Preprocesamiento de </w:t>
+      </w:r>
+      <w:r>
+        <w:rPr>
+          <w:color w:val="auto"/>
+          <w:lang w:val="es-AR"/>
+        </w:rPr>
+        <w:t>d</w:t>
+      </w:r>
+      <w:r>
+        <w:rPr>
+          <w:color w:val="auto"/>
+          <w:lang w:val="es-AR"/>
+        </w:rPr>
+        <w:t>atos</w:t>
+      </w:r>
+    </w:p>
+    <w:p>
+      <w:pPr>
+        <w:pStyle w:val="Ttulo2"/>
+        <w:rPr>
+          <w:color w:val="auto"/>
+          <w:lang w:val="es-AR"/>
+        </w:rPr>
+      </w:pPr>
+      <w:r>
+        <w:rPr>
+          <w:color w:val="auto"/>
+          <w:lang w:val="es-AR"/>
+        </w:rPr>
+        <w:t>4.1 Análisis y eliminación de variables irrelevantes</w:t>
+      </w:r>
+    </w:p>
+    <w:p>
+      <w:pPr>
         <w:spacing w:after="100"/>
         <w:jc w:val="both"/>
         <w:rPr>
@@ -10081,19 +10588,7 @@
         <w:rPr>
           <w:lang w:val="es-AR"/>
         </w:rPr>
-        <w:t>Ningún par de variables superó el umbral de alta correlación (|r| &gt; 0</w:t>
-      </w:r>
-      <w:r>
-        <w:rPr>
-          <w:lang w:val="es-AR"/>
-        </w:rPr>
-        <w:t>,</w:t>
-      </w:r>
-      <w:r>
-        <w:rPr>
-          <w:lang w:val="es-AR"/>
-        </w:rPr>
-        <w:t xml:space="preserve">90) que justificara eliminar alguna columna. Por lo tanto, todas las variables fueron conservadas para el entrenamiento. La correlación entre </w:t>
+        <w:t xml:space="preserve">Las columnas </w:t>
       </w:r>
       <w:proofErr w:type="spellStart"/>
       <w:r>
@@ -10102,7 +10597,7 @@
           <w:iCs/>
           <w:lang w:val="es-AR"/>
         </w:rPr>
-        <w:t>air_temp</w:t>
+        <w:t>idx</w:t>
       </w:r>
       <w:proofErr w:type="spellEnd"/>
       <w:r>
@@ -10118,100 +10613,39 @@
           <w:iCs/>
           <w:lang w:val="es-AR"/>
         </w:rPr>
-        <w:t>process_temp</w:t>
+        <w:t>parent_device_id</w:t>
       </w:r>
       <w:proofErr w:type="spellEnd"/>
       <w:r>
         <w:rPr>
           <w:lang w:val="es-AR"/>
         </w:rPr>
-        <w:t xml:space="preserve"> (0</w:t>
-      </w:r>
-      <w:r>
-        <w:rPr>
-          <w:lang w:val="es-AR"/>
-        </w:rPr>
-        <w:t>,</w:t>
-      </w:r>
-      <w:r>
-        <w:rPr>
-          <w:lang w:val="es-AR"/>
-        </w:rPr>
-        <w:t>86) es la más alta, pero se mantuvo por debajo del umbral definido.</w:t>
-      </w:r>
-    </w:p>
-    <w:p>
-      <w:pPr>
-        <w:rPr>
-          <w:lang w:val="es-AR"/>
-        </w:rPr>
-      </w:pPr>
-      <w:r>
-        <w:rPr>
-          <w:lang w:val="es-AR"/>
-        </w:rPr>
-        <w:br w:type="page"/>
-      </w:r>
-    </w:p>
-    <w:p>
-      <w:pPr>
-        <w:pStyle w:val="Ttulo1"/>
+        <w:t xml:space="preserve"> fueron eliminadas del conjunto de datos previo al entrenamiento. Se trata de identificadores únicos o administrativos que no aportan información semántica ni patrones estadísticos al fenómeno del mantenimiento predictivo. Incluirlas podría llevar a que los modelos memoricen identidades de registros o dispositivos en lugar de aprender los patrones físicos de falla, degradando su capacidad de generalización.</w:t>
+      </w:r>
+    </w:p>
+    <w:p>
+      <w:pPr>
+        <w:pStyle w:val="Ttulo2"/>
         <w:rPr>
           <w:color w:val="auto"/>
           <w:lang w:val="es-AR"/>
         </w:rPr>
       </w:pPr>
-      <w:r>
+    </w:p>
+    <w:p>
+      <w:pPr>
+        <w:pStyle w:val="Ttulo2"/>
         <w:rPr>
           <w:color w:val="auto"/>
           <w:lang w:val="es-AR"/>
         </w:rPr>
-        <w:lastRenderedPageBreak/>
-        <w:t>4. Parte 2</w:t>
-      </w:r>
+      </w:pPr>
       <w:r>
         <w:rPr>
           <w:color w:val="auto"/>
           <w:lang w:val="es-AR"/>
         </w:rPr>
-        <w:t xml:space="preserve"> - </w:t>
-      </w:r>
-      <w:r>
-        <w:rPr>
-          <w:color w:val="auto"/>
-          <w:lang w:val="es-AR"/>
-        </w:rPr>
-        <w:t xml:space="preserve">Preprocesamiento de </w:t>
-      </w:r>
-      <w:r>
-        <w:rPr>
-          <w:color w:val="auto"/>
-          <w:lang w:val="es-AR"/>
-        </w:rPr>
-        <w:t>d</w:t>
-      </w:r>
-      <w:r>
-        <w:rPr>
-          <w:color w:val="auto"/>
-          <w:lang w:val="es-AR"/>
-        </w:rPr>
-        <w:t>atos</w:t>
-      </w:r>
-    </w:p>
-    <w:p>
-      <w:pPr>
-        <w:pStyle w:val="Ttulo2"/>
-        <w:rPr>
-          <w:color w:val="auto"/>
-          <w:lang w:val="es-AR"/>
-        </w:rPr>
-      </w:pPr>
-      <w:r>
-        <w:rPr>
-          <w:color w:val="auto"/>
-          <w:lang w:val="es-AR"/>
-        </w:rPr>
-        <w:t>4.1 Análisis y eliminación de variables irrelevantes</w:t>
+        <w:t>4.2 Tratamiento de valores faltantes</w:t>
       </w:r>
     </w:p>
     <w:p>
@@ -10226,85 +10660,7 @@
         <w:rPr>
           <w:lang w:val="es-AR"/>
         </w:rPr>
-        <w:t xml:space="preserve">Las columnas </w:t>
-      </w:r>
-      <w:proofErr w:type="spellStart"/>
-      <w:r>
-        <w:rPr>
-          <w:i/>
-          <w:iCs/>
-          <w:lang w:val="es-AR"/>
-        </w:rPr>
-        <w:t>idx</w:t>
-      </w:r>
-      <w:proofErr w:type="spellEnd"/>
-      <w:r>
-        <w:rPr>
-          <w:lang w:val="es-AR"/>
-        </w:rPr>
-        <w:t xml:space="preserve"> y </w:t>
-      </w:r>
-      <w:proofErr w:type="spellStart"/>
-      <w:r>
-        <w:rPr>
-          <w:i/>
-          <w:iCs/>
-          <w:lang w:val="es-AR"/>
-        </w:rPr>
-        <w:t>parent_device_id</w:t>
-      </w:r>
-      <w:proofErr w:type="spellEnd"/>
-      <w:r>
-        <w:rPr>
-          <w:lang w:val="es-AR"/>
-        </w:rPr>
-        <w:t xml:space="preserve"> fueron eliminadas del conjunto de datos previo al entrenamiento. Se trata de identificadores únicos o administrativos que no aportan información semántica ni patrones estadísticos al fenómeno del mantenimiento predictivo. Incluirlas podría llevar a que los modelos memoricen identidades de registros o dispositivos en lugar de aprender los patrones físicos de falla, degradando su capacidad de generalización.</w:t>
-      </w:r>
-    </w:p>
-    <w:p>
-      <w:pPr>
-        <w:pStyle w:val="Ttulo2"/>
-        <w:rPr>
-          <w:color w:val="auto"/>
-          <w:lang w:val="es-AR"/>
-        </w:rPr>
-      </w:pPr>
-    </w:p>
-    <w:p>
-      <w:pPr>
-        <w:pStyle w:val="Ttulo2"/>
-        <w:rPr>
-          <w:color w:val="auto"/>
-          <w:lang w:val="es-AR"/>
-        </w:rPr>
-      </w:pPr>
-      <w:r>
-        <w:rPr>
-          <w:color w:val="auto"/>
-          <w:lang w:val="es-AR"/>
-        </w:rPr>
-        <w:t>4.2 Tratamiento de valores faltantes</w:t>
-      </w:r>
-    </w:p>
-    <w:p>
-      <w:pPr>
-        <w:spacing w:after="100"/>
-        <w:jc w:val="both"/>
-        <w:rPr>
-          <w:lang w:val="es-AR"/>
-        </w:rPr>
-      </w:pPr>
-      <w:r>
-        <w:rPr>
-          <w:lang w:val="es-AR"/>
-        </w:rPr>
-        <w:t>Se</w:t>
-      </w:r>
-      <w:r>
-        <w:rPr>
-          <w:lang w:val="es-AR"/>
-        </w:rPr>
-        <w:t xml:space="preserve"> </w:t>
+        <w:t xml:space="preserve">Se </w:t>
       </w:r>
       <w:r>
         <w:rPr>
@@ -10916,12 +11272,6 @@
         <w:gridCol w:w="2415"/>
       </w:tblGrid>
       <w:tr>
-        <w:tblPrEx>
-          <w:tblCellMar>
-            <w:top w:w="0" w:type="dxa"/>
-            <w:bottom w:w="0" w:type="dxa"/>
-          </w:tblCellMar>
-        </w:tblPrEx>
         <w:trPr>
           <w:tblHeader/>
         </w:trPr>
@@ -11095,12 +11445,6 @@
         </w:tc>
       </w:tr>
       <w:tr>
-        <w:tblPrEx>
-          <w:tblCellMar>
-            <w:top w:w="0" w:type="dxa"/>
-            <w:bottom w:w="0" w:type="dxa"/>
-          </w:tblCellMar>
-        </w:tblPrEx>
         <w:tc>
           <w:tcPr>
             <w:tcW w:w="1984" w:type="dxa"/>
@@ -11280,12 +11624,6 @@
         </w:tc>
       </w:tr>
       <w:tr>
-        <w:tblPrEx>
-          <w:tblCellMar>
-            <w:top w:w="0" w:type="dxa"/>
-            <w:bottom w:w="0" w:type="dxa"/>
-          </w:tblCellMar>
-        </w:tblPrEx>
         <w:tc>
           <w:tcPr>
             <w:tcW w:w="1984" w:type="dxa"/>
@@ -11463,12 +11801,6 @@
         </w:tc>
       </w:tr>
       <w:tr>
-        <w:tblPrEx>
-          <w:tblCellMar>
-            <w:top w:w="0" w:type="dxa"/>
-            <w:bottom w:w="0" w:type="dxa"/>
-          </w:tblCellMar>
-        </w:tblPrEx>
         <w:tc>
           <w:tcPr>
             <w:tcW w:w="1984" w:type="dxa"/>
@@ -13196,12 +13528,6 @@
         <w:gridCol w:w="1852"/>
       </w:tblGrid>
       <w:tr>
-        <w:tblPrEx>
-          <w:tblCellMar>
-            <w:top w:w="0" w:type="dxa"/>
-            <w:bottom w:w="0" w:type="dxa"/>
-          </w:tblCellMar>
-        </w:tblPrEx>
         <w:trPr>
           <w:tblHeader/>
         </w:trPr>
@@ -13319,12 +13645,6 @@
         </w:tc>
       </w:tr>
       <w:tr>
-        <w:tblPrEx>
-          <w:tblCellMar>
-            <w:top w:w="0" w:type="dxa"/>
-            <w:bottom w:w="0" w:type="dxa"/>
-          </w:tblCellMar>
-        </w:tblPrEx>
         <w:tc>
           <w:tcPr>
             <w:tcW w:w="1696" w:type="dxa"/>
@@ -13434,12 +13754,6 @@
         </w:tc>
       </w:tr>
       <w:tr>
-        <w:tblPrEx>
-          <w:tblCellMar>
-            <w:top w:w="0" w:type="dxa"/>
-            <w:bottom w:w="0" w:type="dxa"/>
-          </w:tblCellMar>
-        </w:tblPrEx>
         <w:tc>
           <w:tcPr>
             <w:tcW w:w="1696" w:type="dxa"/>
@@ -13538,12 +13852,6 @@
         </w:tc>
       </w:tr>
       <w:tr>
-        <w:tblPrEx>
-          <w:tblCellMar>
-            <w:top w:w="0" w:type="dxa"/>
-            <w:bottom w:w="0" w:type="dxa"/>
-          </w:tblCellMar>
-        </w:tblPrEx>
         <w:tc>
           <w:tcPr>
             <w:tcW w:w="1696" w:type="dxa"/>
@@ -13631,12 +13939,6 @@
         </w:tc>
       </w:tr>
       <w:tr>
-        <w:tblPrEx>
-          <w:tblCellMar>
-            <w:top w:w="0" w:type="dxa"/>
-            <w:bottom w:w="0" w:type="dxa"/>
-          </w:tblCellMar>
-        </w:tblPrEx>
         <w:tc>
           <w:tcPr>
             <w:tcW w:w="1696" w:type="dxa"/>
@@ -13766,12 +14068,6 @@
         </w:tc>
       </w:tr>
       <w:tr>
-        <w:tblPrEx>
-          <w:tblCellMar>
-            <w:top w:w="0" w:type="dxa"/>
-            <w:bottom w:w="0" w:type="dxa"/>
-          </w:tblCellMar>
-        </w:tblPrEx>
         <w:tc>
           <w:tcPr>
             <w:tcW w:w="1696" w:type="dxa"/>
@@ -14057,12 +14353,6 @@
         <w:gridCol w:w="1755"/>
       </w:tblGrid>
       <w:tr>
-        <w:tblPrEx>
-          <w:tblCellMar>
-            <w:top w:w="0" w:type="dxa"/>
-            <w:bottom w:w="0" w:type="dxa"/>
-          </w:tblCellMar>
-        </w:tblPrEx>
         <w:trPr>
           <w:tblHeader/>
         </w:trPr>
@@ -14205,12 +14495,6 @@
         </w:tc>
       </w:tr>
       <w:tr>
-        <w:tblPrEx>
-          <w:tblCellMar>
-            <w:top w:w="0" w:type="dxa"/>
-            <w:bottom w:w="0" w:type="dxa"/>
-          </w:tblCellMar>
-        </w:tblPrEx>
         <w:tc>
           <w:tcPr>
             <w:tcW w:w="2340" w:type="dxa"/>
@@ -14331,12 +14615,6 @@
         </w:tc>
       </w:tr>
       <w:tr>
-        <w:tblPrEx>
-          <w:tblCellMar>
-            <w:top w:w="0" w:type="dxa"/>
-            <w:bottom w:w="0" w:type="dxa"/>
-          </w:tblCellMar>
-        </w:tblPrEx>
         <w:tc>
           <w:tcPr>
             <w:tcW w:w="2340" w:type="dxa"/>
@@ -14647,12 +14925,6 @@
         <w:gridCol w:w="1843"/>
       </w:tblGrid>
       <w:tr>
-        <w:tblPrEx>
-          <w:tblCellMar>
-            <w:top w:w="0" w:type="dxa"/>
-            <w:bottom w:w="0" w:type="dxa"/>
-          </w:tblCellMar>
-        </w:tblPrEx>
         <w:tc>
           <w:tcPr>
             <w:tcW w:w="1686" w:type="dxa"/>
@@ -14769,12 +15041,6 @@
         </w:tc>
       </w:tr>
       <w:tr>
-        <w:tblPrEx>
-          <w:tblCellMar>
-            <w:top w:w="0" w:type="dxa"/>
-            <w:bottom w:w="0" w:type="dxa"/>
-          </w:tblCellMar>
-        </w:tblPrEx>
         <w:tc>
           <w:tcPr>
             <w:tcW w:w="1686" w:type="dxa"/>
@@ -14897,12 +15163,6 @@
         </w:tc>
       </w:tr>
       <w:tr>
-        <w:tblPrEx>
-          <w:tblCellMar>
-            <w:top w:w="0" w:type="dxa"/>
-            <w:bottom w:w="0" w:type="dxa"/>
-          </w:tblCellMar>
-        </w:tblPrEx>
         <w:tc>
           <w:tcPr>
             <w:tcW w:w="1686" w:type="dxa"/>
@@ -15407,12 +15667,6 @@
         <w:gridCol w:w="1710"/>
       </w:tblGrid>
       <w:tr>
-        <w:tblPrEx>
-          <w:tblCellMar>
-            <w:top w:w="0" w:type="dxa"/>
-            <w:bottom w:w="0" w:type="dxa"/>
-          </w:tblCellMar>
-        </w:tblPrEx>
         <w:trPr>
           <w:tblHeader/>
         </w:trPr>
@@ -15532,12 +15786,6 @@
         </w:tc>
       </w:tr>
       <w:tr>
-        <w:tblPrEx>
-          <w:tblCellMar>
-            <w:top w:w="0" w:type="dxa"/>
-            <w:bottom w:w="0" w:type="dxa"/>
-          </w:tblCellMar>
-        </w:tblPrEx>
         <w:tc>
           <w:tcPr>
             <w:tcW w:w="1696" w:type="dxa"/>
@@ -15628,12 +15876,6 @@
         </w:tc>
       </w:tr>
       <w:tr>
-        <w:tblPrEx>
-          <w:tblCellMar>
-            <w:top w:w="0" w:type="dxa"/>
-            <w:bottom w:w="0" w:type="dxa"/>
-          </w:tblCellMar>
-        </w:tblPrEx>
         <w:tc>
           <w:tcPr>
             <w:tcW w:w="1696" w:type="dxa"/>
@@ -15729,12 +15971,6 @@
         </w:tc>
       </w:tr>
       <w:tr>
-        <w:tblPrEx>
-          <w:tblCellMar>
-            <w:top w:w="0" w:type="dxa"/>
-            <w:bottom w:w="0" w:type="dxa"/>
-          </w:tblCellMar>
-        </w:tblPrEx>
         <w:tc>
           <w:tcPr>
             <w:tcW w:w="1696" w:type="dxa"/>
@@ -15822,12 +16058,6 @@
         </w:tc>
       </w:tr>
       <w:tr>
-        <w:tblPrEx>
-          <w:tblCellMar>
-            <w:top w:w="0" w:type="dxa"/>
-            <w:bottom w:w="0" w:type="dxa"/>
-          </w:tblCellMar>
-        </w:tblPrEx>
         <w:tc>
           <w:tcPr>
             <w:tcW w:w="1696" w:type="dxa"/>
@@ -15916,12 +16146,6 @@
         </w:tc>
       </w:tr>
       <w:tr>
-        <w:tblPrEx>
-          <w:tblCellMar>
-            <w:top w:w="0" w:type="dxa"/>
-            <w:bottom w:w="0" w:type="dxa"/>
-          </w:tblCellMar>
-        </w:tblPrEx>
         <w:tc>
           <w:tcPr>
             <w:tcW w:w="1696" w:type="dxa"/>
@@ -16296,12 +16520,6 @@
         <w:gridCol w:w="1755"/>
       </w:tblGrid>
       <w:tr>
-        <w:tblPrEx>
-          <w:tblCellMar>
-            <w:top w:w="0" w:type="dxa"/>
-            <w:bottom w:w="0" w:type="dxa"/>
-          </w:tblCellMar>
-        </w:tblPrEx>
         <w:trPr>
           <w:tblHeader/>
         </w:trPr>
@@ -16444,12 +16662,6 @@
         </w:tc>
       </w:tr>
       <w:tr>
-        <w:tblPrEx>
-          <w:tblCellMar>
-            <w:top w:w="0" w:type="dxa"/>
-            <w:bottom w:w="0" w:type="dxa"/>
-          </w:tblCellMar>
-        </w:tblPrEx>
         <w:tc>
           <w:tcPr>
             <w:tcW w:w="2340" w:type="dxa"/>
@@ -16552,12 +16764,6 @@
         </w:tc>
       </w:tr>
       <w:tr>
-        <w:tblPrEx>
-          <w:tblCellMar>
-            <w:top w:w="0" w:type="dxa"/>
-            <w:bottom w:w="0" w:type="dxa"/>
-          </w:tblCellMar>
-        </w:tblPrEx>
         <w:tc>
           <w:tcPr>
             <w:tcW w:w="2340" w:type="dxa"/>
@@ -16848,12 +17054,6 @@
         <w:gridCol w:w="1726"/>
       </w:tblGrid>
       <w:tr>
-        <w:tblPrEx>
-          <w:tblCellMar>
-            <w:top w:w="0" w:type="dxa"/>
-            <w:bottom w:w="0" w:type="dxa"/>
-          </w:tblCellMar>
-        </w:tblPrEx>
         <w:tc>
           <w:tcPr>
             <w:tcW w:w="1686" w:type="dxa"/>
@@ -16970,12 +17170,6 @@
         </w:tc>
       </w:tr>
       <w:tr>
-        <w:tblPrEx>
-          <w:tblCellMar>
-            <w:top w:w="0" w:type="dxa"/>
-            <w:bottom w:w="0" w:type="dxa"/>
-          </w:tblCellMar>
-        </w:tblPrEx>
         <w:tc>
           <w:tcPr>
             <w:tcW w:w="1686" w:type="dxa"/>
@@ -17098,12 +17292,6 @@
         </w:tc>
       </w:tr>
       <w:tr>
-        <w:tblPrEx>
-          <w:tblCellMar>
-            <w:top w:w="0" w:type="dxa"/>
-            <w:bottom w:w="0" w:type="dxa"/>
-          </w:tblCellMar>
-        </w:tblPrEx>
         <w:tc>
           <w:tcPr>
             <w:tcW w:w="1686" w:type="dxa"/>
@@ -17823,12 +18011,6 @@
         <w:gridCol w:w="2360"/>
       </w:tblGrid>
       <w:tr>
-        <w:tblPrEx>
-          <w:tblCellMar>
-            <w:top w:w="0" w:type="dxa"/>
-            <w:bottom w:w="0" w:type="dxa"/>
-          </w:tblCellMar>
-        </w:tblPrEx>
         <w:trPr>
           <w:tblHeader/>
         </w:trPr>
@@ -17948,12 +18130,6 @@
         </w:tc>
       </w:tr>
       <w:tr>
-        <w:tblPrEx>
-          <w:tblCellMar>
-            <w:top w:w="0" w:type="dxa"/>
-            <w:bottom w:w="0" w:type="dxa"/>
-          </w:tblCellMar>
-        </w:tblPrEx>
         <w:tc>
           <w:tcPr>
             <w:tcW w:w="2200" w:type="dxa"/>
@@ -18033,12 +18209,6 @@
         </w:tc>
       </w:tr>
       <w:tr>
-        <w:tblPrEx>
-          <w:tblCellMar>
-            <w:top w:w="0" w:type="dxa"/>
-            <w:bottom w:w="0" w:type="dxa"/>
-          </w:tblCellMar>
-        </w:tblPrEx>
         <w:tc>
           <w:tcPr>
             <w:tcW w:w="2200" w:type="dxa"/>
@@ -18118,12 +18288,6 @@
         </w:tc>
       </w:tr>
       <w:tr>
-        <w:tblPrEx>
-          <w:tblCellMar>
-            <w:top w:w="0" w:type="dxa"/>
-            <w:bottom w:w="0" w:type="dxa"/>
-          </w:tblCellMar>
-        </w:tblPrEx>
         <w:tc>
           <w:tcPr>
             <w:tcW w:w="2200" w:type="dxa"/>
@@ -18203,12 +18367,6 @@
         </w:tc>
       </w:tr>
       <w:tr>
-        <w:tblPrEx>
-          <w:tblCellMar>
-            <w:top w:w="0" w:type="dxa"/>
-            <w:bottom w:w="0" w:type="dxa"/>
-          </w:tblCellMar>
-        </w:tblPrEx>
         <w:tc>
           <w:tcPr>
             <w:tcW w:w="2200" w:type="dxa"/>
@@ -18550,12 +18708,6 @@
         <w:gridCol w:w="1755"/>
       </w:tblGrid>
       <w:tr>
-        <w:tblPrEx>
-          <w:tblCellMar>
-            <w:top w:w="0" w:type="dxa"/>
-            <w:bottom w:w="0" w:type="dxa"/>
-          </w:tblCellMar>
-        </w:tblPrEx>
         <w:trPr>
           <w:tblHeader/>
         </w:trPr>
@@ -18728,12 +18880,6 @@
         </w:tc>
       </w:tr>
       <w:tr>
-        <w:tblPrEx>
-          <w:tblCellMar>
-            <w:top w:w="0" w:type="dxa"/>
-            <w:bottom w:w="0" w:type="dxa"/>
-          </w:tblCellMar>
-        </w:tblPrEx>
         <w:tc>
           <w:tcPr>
             <w:tcW w:w="2340" w:type="dxa"/>
@@ -18866,12 +19012,6 @@
         </w:tc>
       </w:tr>
       <w:tr>
-        <w:tblPrEx>
-          <w:tblCellMar>
-            <w:top w:w="0" w:type="dxa"/>
-            <w:bottom w:w="0" w:type="dxa"/>
-          </w:tblCellMar>
-        </w:tblPrEx>
         <w:tc>
           <w:tcPr>
             <w:tcW w:w="2340" w:type="dxa"/>
@@ -19212,12 +19352,6 @@
         <w:gridCol w:w="1726"/>
       </w:tblGrid>
       <w:tr>
-        <w:tblPrEx>
-          <w:tblCellMar>
-            <w:top w:w="0" w:type="dxa"/>
-            <w:bottom w:w="0" w:type="dxa"/>
-          </w:tblCellMar>
-        </w:tblPrEx>
         <w:tc>
           <w:tcPr>
             <w:tcW w:w="1686" w:type="dxa"/>
@@ -19322,12 +19456,6 @@
         </w:tc>
       </w:tr>
       <w:tr>
-        <w:tblPrEx>
-          <w:tblCellMar>
-            <w:top w:w="0" w:type="dxa"/>
-            <w:bottom w:w="0" w:type="dxa"/>
-          </w:tblCellMar>
-        </w:tblPrEx>
         <w:tc>
           <w:tcPr>
             <w:tcW w:w="1686" w:type="dxa"/>
@@ -19450,12 +19578,6 @@
         </w:tc>
       </w:tr>
       <w:tr>
-        <w:tblPrEx>
-          <w:tblCellMar>
-            <w:top w:w="0" w:type="dxa"/>
-            <w:bottom w:w="0" w:type="dxa"/>
-          </w:tblCellMar>
-        </w:tblPrEx>
         <w:tc>
           <w:tcPr>
             <w:tcW w:w="1686" w:type="dxa"/>
@@ -19764,12 +19886,6 @@
         <w:gridCol w:w="2340"/>
       </w:tblGrid>
       <w:tr>
-        <w:tblPrEx>
-          <w:tblCellMar>
-            <w:top w:w="0" w:type="dxa"/>
-            <w:bottom w:w="0" w:type="dxa"/>
-          </w:tblCellMar>
-        </w:tblPrEx>
         <w:trPr>
           <w:tblHeader/>
         </w:trPr>
@@ -19867,12 +19983,6 @@
         </w:tc>
       </w:tr>
       <w:tr>
-        <w:tblPrEx>
-          <w:tblCellMar>
-            <w:top w:w="0" w:type="dxa"/>
-            <w:bottom w:w="0" w:type="dxa"/>
-          </w:tblCellMar>
-        </w:tblPrEx>
         <w:tc>
           <w:tcPr>
             <w:tcW w:w="4680" w:type="dxa"/>
@@ -19949,12 +20059,6 @@
         </w:tc>
       </w:tr>
       <w:tr>
-        <w:tblPrEx>
-          <w:tblCellMar>
-            <w:top w:w="0" w:type="dxa"/>
-            <w:bottom w:w="0" w:type="dxa"/>
-          </w:tblCellMar>
-        </w:tblPrEx>
         <w:tc>
           <w:tcPr>
             <w:tcW w:w="4680" w:type="dxa"/>
@@ -20031,12 +20135,6 @@
         </w:tc>
       </w:tr>
       <w:tr>
-        <w:tblPrEx>
-          <w:tblCellMar>
-            <w:top w:w="0" w:type="dxa"/>
-            <w:bottom w:w="0" w:type="dxa"/>
-          </w:tblCellMar>
-        </w:tblPrEx>
         <w:tc>
           <w:tcPr>
             <w:tcW w:w="4680" w:type="dxa"/>
@@ -20122,12 +20220,6 @@
         </w:tc>
       </w:tr>
       <w:tr>
-        <w:tblPrEx>
-          <w:tblCellMar>
-            <w:top w:w="0" w:type="dxa"/>
-            <w:bottom w:w="0" w:type="dxa"/>
-          </w:tblCellMar>
-        </w:tblPrEx>
         <w:tc>
           <w:tcPr>
             <w:tcW w:w="4680" w:type="dxa"/>
@@ -20213,12 +20305,6 @@
         </w:tc>
       </w:tr>
       <w:tr>
-        <w:tblPrEx>
-          <w:tblCellMar>
-            <w:top w:w="0" w:type="dxa"/>
-            <w:bottom w:w="0" w:type="dxa"/>
-          </w:tblCellMar>
-        </w:tblPrEx>
         <w:tc>
           <w:tcPr>
             <w:tcW w:w="4680" w:type="dxa"/>
@@ -20304,12 +20390,6 @@
         </w:tc>
       </w:tr>
       <w:tr>
-        <w:tblPrEx>
-          <w:tblCellMar>
-            <w:top w:w="0" w:type="dxa"/>
-            <w:bottom w:w="0" w:type="dxa"/>
-          </w:tblCellMar>
-        </w:tblPrEx>
         <w:tc>
           <w:tcPr>
             <w:tcW w:w="4680" w:type="dxa"/>
@@ -20388,12 +20468,6 @@
         </w:tc>
       </w:tr>
       <w:tr>
-        <w:tblPrEx>
-          <w:tblCellMar>
-            <w:top w:w="0" w:type="dxa"/>
-            <w:bottom w:w="0" w:type="dxa"/>
-          </w:tblCellMar>
-        </w:tblPrEx>
         <w:tc>
           <w:tcPr>
             <w:tcW w:w="4680" w:type="dxa"/>
@@ -20472,12 +20546,6 @@
         </w:tc>
       </w:tr>
       <w:tr>
-        <w:tblPrEx>
-          <w:tblCellMar>
-            <w:top w:w="0" w:type="dxa"/>
-            <w:bottom w:w="0" w:type="dxa"/>
-          </w:tblCellMar>
-        </w:tblPrEx>
         <w:tc>
           <w:tcPr>
             <w:tcW w:w="4680" w:type="dxa"/>
@@ -20757,12 +20825,6 @@
         <w:gridCol w:w="1060"/>
       </w:tblGrid>
       <w:tr>
-        <w:tblPrEx>
-          <w:tblCellMar>
-            <w:top w:w="0" w:type="dxa"/>
-            <w:bottom w:w="0" w:type="dxa"/>
-          </w:tblCellMar>
-        </w:tblPrEx>
         <w:trPr>
           <w:tblHeader/>
         </w:trPr>
@@ -20941,12 +21003,6 @@
         </w:tc>
       </w:tr>
       <w:tr>
-        <w:tblPrEx>
-          <w:tblCellMar>
-            <w:top w:w="0" w:type="dxa"/>
-            <w:bottom w:w="0" w:type="dxa"/>
-          </w:tblCellMar>
-        </w:tblPrEx>
         <w:tc>
           <w:tcPr>
             <w:tcW w:w="2100" w:type="dxa"/>
@@ -21115,12 +21171,6 @@
         </w:tc>
       </w:tr>
       <w:tr>
-        <w:tblPrEx>
-          <w:tblCellMar>
-            <w:top w:w="0" w:type="dxa"/>
-            <w:bottom w:w="0" w:type="dxa"/>
-          </w:tblCellMar>
-        </w:tblPrEx>
         <w:tc>
           <w:tcPr>
             <w:tcW w:w="2100" w:type="dxa"/>
@@ -21280,12 +21330,6 @@
         </w:tc>
       </w:tr>
       <w:tr>
-        <w:tblPrEx>
-          <w:tblCellMar>
-            <w:top w:w="0" w:type="dxa"/>
-            <w:bottom w:w="0" w:type="dxa"/>
-          </w:tblCellMar>
-        </w:tblPrEx>
         <w:tc>
           <w:tcPr>
             <w:tcW w:w="2100" w:type="dxa"/>
@@ -23005,8 +23049,8 @@
       </w:r>
     </w:p>
     <w:sectPr>
-      <w:headerReference w:type="default" r:id="rId22"/>
-      <w:footerReference w:type="default" r:id="rId23"/>
+      <w:headerReference w:type="default" r:id="rId25"/>
+      <w:footerReference w:type="default" r:id="rId26"/>
       <w:pgSz w:w="12240" w:h="15840"/>
       <w:pgMar w:top="1440" w:right="1440" w:bottom="1440" w:left="1440" w:header="708" w:footer="708" w:gutter="0"/>
       <w:cols w:space="720"/>
@@ -23109,6 +23153,20 @@
       </w:rPr>
       <w:t>UTN FRSF - Ciencia de Datos - TP N°1</w:t>
     </w:r>
+    <w:r>
+      <w:rPr>
+        <w:lang w:val="es-AR"/>
+      </w:rPr>
+      <w:t xml:space="preserve"> - Herbel, Soler, Meyer, </w:t>
+    </w:r>
+    <w:proofErr w:type="spellStart"/>
+    <w:r>
+      <w:rPr>
+        <w:lang w:val="es-AR"/>
+      </w:rPr>
+      <w:t>Oggier</w:t>
+    </w:r>
+    <w:proofErr w:type="spellEnd"/>
   </w:p>
 </w:hdr>
 </file>
@@ -23718,7 +23776,7 @@
   <w:style w:type="paragraph" w:default="1" w:styleId="Normal">
     <w:name w:val="Normal"/>
     <w:qFormat/>
-    <w:rsid w:val="00AD0BC9"/>
+    <w:rsid w:val="00122AFA"/>
   </w:style>
   <w:style w:type="paragraph" w:styleId="Ttulo1">
     <w:name w:val="heading 1"/>
@@ -23814,6 +23872,7 @@
   <w:style w:type="character" w:default="1" w:styleId="Fuentedeprrafopredeter">
     <w:name w:val="Default Paragraph Font"/>
     <w:uiPriority w:val="1"/>
+    <w:semiHidden/>
     <w:unhideWhenUsed/>
   </w:style>
   <w:style w:type="table" w:default="1" w:styleId="Tablanormal">

</xml_diff>